<commit_message>
Standup entry for sprint 6
</commit_message>
<xml_diff>
--- a/docs/DailyStandups/DailySM_18.docx
+++ b/docs/DailyStandups/DailySM_18.docx
@@ -1,110 +1,177 @@
 
 <file path=word/document.xml><?xml version="1.0" encoding="utf-8"?>
-<w:document xmlns:wpc="http://schemas.microsoft.com/office/word/2010/wordprocessingCanvas" xmlns:cx="http://schemas.microsoft.com/office/drawing/2014/chartex" xmlns:cx1="http://schemas.microsoft.com/office/drawing/2015/9/8/chartex" xmlns:cx2="http://schemas.microsoft.com/office/drawing/2015/10/21/chartex" xmlns:cx3="http://schemas.microsoft.com/office/drawing/2016/5/9/chartex" xmlns:cx4="http://schemas.microsoft.com/office/drawing/2016/5/10/chartex" xmlns:cx5="http://schemas.microsoft.com/office/drawing/2016/5/11/chartex" xmlns:cx6="http://schemas.microsoft.com/office/drawing/2016/5/12/chartex" xmlns:cx7="http://schemas.microsoft.com/office/drawing/2016/5/13/chartex" xmlns:cx8="http://schemas.microsoft.com/office/drawing/2016/5/14/chartex" xmlns:mc="http://schemas.openxmlformats.org/markup-compatibility/2006" xmlns:aink="http://schemas.microsoft.com/office/drawing/2016/ink" xmlns:am3d="http://schemas.microsoft.com/office/drawing/2017/model3d" xmlns:o="urn:schemas-microsoft-com:office:office" xmlns:oel="http://schemas.microsoft.com/office/2019/extlst" xmlns:r="http://schemas.openxmlformats.org/officeDocument/2006/relationships" xmlns:m="http://schemas.openxmlformats.org/officeDocument/2006/math" xmlns:v="urn:schemas-microsoft-com:vml" xmlns:wp14="http://schemas.microsoft.com/office/word/2010/wordprocessingDrawing" xmlns:wp="http://schemas.openxmlformats.org/drawingml/2006/wordprocessingDrawing" xmlns:w10="urn:schemas-microsoft-com:office:word" xmlns:w="http://schemas.openxmlformats.org/wordprocessingml/2006/main" xmlns:w14="http://schemas.microsoft.com/office/word/2010/wordml" xmlns:w15="http://schemas.microsoft.com/office/word/2012/wordml" xmlns:w16cex="http://schemas.microsoft.com/office/word/2018/wordml/cex" xmlns:w16cid="http://schemas.microsoft.com/office/word/2016/wordml/cid" xmlns:w16="http://schemas.microsoft.com/office/word/2018/wordml" xmlns:w16du="http://schemas.microsoft.com/office/word/2023/wordml/word16du" xmlns:w16sdtdh="http://schemas.microsoft.com/office/word/2020/wordml/sdtdatahash" xmlns:w16sdtfl="http://schemas.microsoft.com/office/word/2024/wordml/sdtformatlock" xmlns:w16se="http://schemas.microsoft.com/office/word/2015/wordml/symex" xmlns:wpg="http://schemas.microsoft.com/office/word/2010/wordprocessingGroup" xmlns:wpi="http://schemas.microsoft.com/office/word/2010/wordprocessingInk" xmlns:wne="http://schemas.microsoft.com/office/word/2006/wordml" xmlns:wps="http://schemas.microsoft.com/office/word/2010/wordprocessingShape" mc:Ignorable="w14 w15 w16se w16cid w16 w16cex w16sdtdh w16sdtfl w16du wp14">
+<w:document xmlns:o="urn:schemas-microsoft-com:office:office" xmlns:r="http://schemas.openxmlformats.org/officeDocument/2006/relationships" xmlns:v="urn:schemas-microsoft-com:vml" xmlns:w="http://schemas.openxmlformats.org/wordprocessingml/2006/main" xmlns:w10="urn:schemas-microsoft-com:office:word" xmlns:wp="http://schemas.openxmlformats.org/drawingml/2006/wordprocessingDrawing" xmlns:wps="http://schemas.microsoft.com/office/word/2010/wordprocessingShape" xmlns:wpg="http://schemas.microsoft.com/office/word/2010/wordprocessingGroup" xmlns:mc="http://schemas.openxmlformats.org/markup-compatibility/2006" xmlns:wp14="http://schemas.microsoft.com/office/word/2010/wordprocessingDrawing" xmlns:w14="http://schemas.microsoft.com/office/word/2010/wordml" xmlns:w15="http://schemas.microsoft.com/office/word/2012/wordml" mc:Ignorable="w14 wp14 w15">
   <w:body>
     <w:p>
       <w:pPr>
         <w:pStyle w:val="Title"/>
         <w:jc w:val="center"/>
-      </w:pPr>
-      <w:r>
-        <w:t>D</w:t>
-      </w:r>
-      <w:r>
-        <w:t xml:space="preserve">aily </w:t>
-      </w:r>
-      <w:r>
-        <w:t>S</w:t>
-      </w:r>
-      <w:r>
-        <w:t xml:space="preserve">tandup </w:t>
-      </w:r>
-      <w:r>
-        <w:t>M</w:t>
-      </w:r>
-      <w:r>
-        <w:t>eeting</w:t>
+        <w:rPr/>
+      </w:pPr>
+      <w:r>
+        <w:rPr/>
+        <w:t>Daily Standup Meeting</w:t>
       </w:r>
     </w:p>
     <w:tbl>
       <w:tblPr>
         <w:tblStyle w:val="TableGrid"/>
-        <w:tblW w:w="0" w:type="auto"/>
-        <w:tblLook w:val="04A0" w:firstRow="1" w:lastRow="0" w:firstColumn="1" w:lastColumn="0" w:noHBand="0" w:noVBand="1"/>
+        <w:tblW w:w="9016" w:type="dxa"/>
+        <w:jc w:val="left"/>
+        <w:tblInd w:w="0" w:type="dxa"/>
+        <w:tblLayout w:type="fixed"/>
+        <w:tblCellMar>
+          <w:top w:w="0" w:type="dxa"/>
+          <w:left w:w="108" w:type="dxa"/>
+          <w:bottom w:w="0" w:type="dxa"/>
+          <w:right w:w="108" w:type="dxa"/>
+        </w:tblCellMar>
+        <w:tblLook w:val="04a0" w:noHBand="0" w:noVBand="1" w:firstColumn="1" w:lastRow="0" w:lastColumn="0" w:firstRow="1"/>
       </w:tblPr>
       <w:tblGrid>
         <w:gridCol w:w="4508"/>
-        <w:gridCol w:w="4508"/>
+        <w:gridCol w:w="4507"/>
       </w:tblGrid>
       <w:tr>
+        <w:trPr/>
         <w:tc>
           <w:tcPr>
             <w:tcW w:w="4508" w:type="dxa"/>
+            <w:tcBorders/>
           </w:tcPr>
           <w:p>
             <w:pPr>
-              <w:spacing w:after="160"/>
+              <w:pStyle w:val="Normal"/>
+              <w:widowControl/>
+              <w:spacing w:before="0" w:after="160"/>
+              <w:jc w:val="left"/>
+              <w:rPr>
+                <w:rFonts w:ascii="Aptos" w:hAnsi="Aptos" w:eastAsia="Aptos" w:cs=""/>
+                <w:lang w:eastAsia="en-US" w:bidi="ar-SA"/>
+              </w:rPr>
             </w:pPr>
             <w:r>
+              <w:rPr>
+                <w:rFonts w:eastAsia="Aptos" w:cs=""/>
+                <w:lang w:eastAsia="en-US" w:bidi="ar-SA"/>
+              </w:rPr>
               <w:t>MainsAuction</w:t>
             </w:r>
           </w:p>
         </w:tc>
         <w:tc>
           <w:tcPr>
-            <w:tcW w:w="4508" w:type="dxa"/>
+            <w:tcW w:w="4507" w:type="dxa"/>
+            <w:tcBorders/>
           </w:tcPr>
           <w:p>
+            <w:pPr>
+              <w:pStyle w:val="Normal"/>
+              <w:widowControl/>
+              <w:spacing w:before="0" w:after="0"/>
+              <w:jc w:val="left"/>
+              <w:rPr>
+                <w:rFonts w:ascii="Aptos" w:hAnsi="Aptos" w:eastAsia="Aptos" w:cs=""/>
+                <w:lang w:eastAsia="en-US" w:bidi="ar-SA"/>
+              </w:rPr>
+            </w:pPr>
             <w:r>
+              <w:rPr>
+                <w:rFonts w:eastAsia="Aptos" w:cs=""/>
+                <w:lang w:eastAsia="en-US" w:bidi="ar-SA"/>
+              </w:rPr>
               <w:t>Group Name: Mains</w:t>
             </w:r>
           </w:p>
         </w:tc>
       </w:tr>
       <w:tr>
+        <w:trPr/>
         <w:tc>
           <w:tcPr>
             <w:tcW w:w="4508" w:type="dxa"/>
+            <w:tcBorders/>
           </w:tcPr>
           <w:p>
+            <w:pPr>
+              <w:pStyle w:val="Normal"/>
+              <w:widowControl/>
+              <w:spacing w:before="0" w:after="0"/>
+              <w:jc w:val="left"/>
+              <w:rPr>
+                <w:rFonts w:ascii="Aptos" w:hAnsi="Aptos" w:eastAsia="Aptos" w:cs=""/>
+                <w:lang w:eastAsia="en-US" w:bidi="ar-SA"/>
+              </w:rPr>
+            </w:pPr>
             <w:r>
-              <w:t xml:space="preserve">Sprint Number: </w:t>
-            </w:r>
-            <w:r>
-              <w:t>6</w:t>
+              <w:rPr>
+                <w:rFonts w:eastAsia="Aptos" w:cs=""/>
+                <w:lang w:eastAsia="en-US" w:bidi="ar-SA"/>
+              </w:rPr>
+              <w:t>Sprint Number: 6</w:t>
             </w:r>
           </w:p>
-          <w:p/>
+          <w:p>
+            <w:pPr>
+              <w:pStyle w:val="Normal"/>
+              <w:widowControl/>
+              <w:spacing w:before="0" w:after="0"/>
+              <w:jc w:val="left"/>
+              <w:rPr>
+                <w:rFonts w:ascii="Aptos" w:hAnsi="Aptos" w:eastAsia="Aptos" w:cs=""/>
+                <w:lang w:eastAsia="en-US" w:bidi="ar-SA"/>
+              </w:rPr>
+            </w:pPr>
+            <w:r>
+              <w:rPr>
+                <w:rFonts w:eastAsia="Aptos" w:cs=""/>
+                <w:lang w:eastAsia="en-US" w:bidi="ar-SA"/>
+              </w:rPr>
+            </w:r>
+          </w:p>
         </w:tc>
         <w:tc>
           <w:tcPr>
-            <w:tcW w:w="4508" w:type="dxa"/>
+            <w:tcW w:w="4507" w:type="dxa"/>
+            <w:tcBorders/>
           </w:tcPr>
           <w:p>
+            <w:pPr>
+              <w:pStyle w:val="Normal"/>
+              <w:widowControl/>
+              <w:spacing w:before="0" w:after="0"/>
+              <w:jc w:val="left"/>
+              <w:rPr>
+                <w:rFonts w:ascii="Aptos" w:hAnsi="Aptos" w:eastAsia="Aptos" w:cs=""/>
+                <w:lang w:eastAsia="en-US" w:bidi="ar-SA"/>
+              </w:rPr>
+            </w:pPr>
             <w:r>
-              <w:t xml:space="preserve">Date and Time: </w:t>
-            </w:r>
-            <w:r>
-              <w:t>15</w:t>
-            </w:r>
-            <w:r>
-              <w:t>.0</w:t>
-            </w:r>
-            <w:r>
-              <w:t>4</w:t>
-            </w:r>
-            <w:r>
-              <w:t>.2026</w:t>
+              <w:rPr>
+                <w:rFonts w:eastAsia="Aptos" w:cs=""/>
+                <w:lang w:eastAsia="en-US" w:bidi="ar-SA"/>
+              </w:rPr>
+              <w:t>Date and Time: 15.04.2026</w:t>
             </w:r>
           </w:p>
         </w:tc>
       </w:tr>
     </w:tbl>
-    <w:p/>
-    <w:p>
-      <w:pPr>
+    <w:p>
+      <w:pPr>
+        <w:pStyle w:val="Normal"/>
+        <w:rPr/>
+      </w:pPr>
+      <w:r>
+        <w:rPr/>
+      </w:r>
+    </w:p>
+    <w:p>
+      <w:pPr>
+        <w:pStyle w:val="Normal"/>
         <w:jc w:val="center"/>
         <w:rPr>
+          <w:b/>
           <w:b/>
           <w:bCs/>
           <w:u w:val="single"/>
@@ -126,32 +193,23 @@
           <w:ilvl w:val="0"/>
           <w:numId w:val="1"/>
         </w:numPr>
+        <w:rPr/>
       </w:pPr>
       <w:bookmarkStart w:id="0" w:name="_Hlk159929215"/>
       <w:r>
+        <w:rPr/>
         <w:t>Name: Elysia</w:t>
-      </w:r>
-      <w:r>
         <w:tab/>
-      </w:r>
-      <w:r>
         <w:tab/>
-      </w:r>
-      <w:r>
         <w:tab/>
-      </w:r>
-      <w:r>
         <w:tab/>
-      </w:r>
-      <w:r>
         <w:tab/>
-      </w:r>
-      <w:r>
         <w:tab/>
         <w:t xml:space="preserve">Attended? </w:t>
       </w:r>
       <w:bookmarkEnd w:id="0"/>
       <w:r>
+        <w:rPr/>
         <w:t>YES</w:t>
       </w:r>
     </w:p>
@@ -162,26 +220,16 @@
           <w:ilvl w:val="0"/>
           <w:numId w:val="1"/>
         </w:numPr>
-      </w:pPr>
-      <w:r>
+        <w:rPr/>
+      </w:pPr>
+      <w:r>
+        <w:rPr/>
         <w:t>Name: Lee</w:t>
-      </w:r>
-      <w:r>
         <w:tab/>
-      </w:r>
-      <w:r>
         <w:tab/>
-      </w:r>
-      <w:r>
         <w:tab/>
-      </w:r>
-      <w:r>
         <w:tab/>
-      </w:r>
-      <w:r>
         <w:tab/>
-      </w:r>
-      <w:r>
         <w:tab/>
         <w:t>Attended? YES</w:t>
       </w:r>
@@ -193,26 +241,16 @@
           <w:ilvl w:val="0"/>
           <w:numId w:val="1"/>
         </w:numPr>
-      </w:pPr>
-      <w:r>
+        <w:rPr/>
+      </w:pPr>
+      <w:r>
+        <w:rPr/>
         <w:t>Name: Gaia</w:t>
-      </w:r>
-      <w:r>
         <w:tab/>
-      </w:r>
-      <w:r>
         <w:tab/>
-      </w:r>
-      <w:r>
         <w:tab/>
-      </w:r>
-      <w:r>
         <w:tab/>
-      </w:r>
-      <w:r>
         <w:tab/>
-      </w:r>
-      <w:r>
         <w:tab/>
         <w:t>Attended? YES</w:t>
       </w:r>
@@ -226,29 +264,19 @@
         </w:numPr>
         <w:rPr>
           <w:b/>
+          <w:b/>
           <w:bCs/>
           <w:u w:val="single"/>
         </w:rPr>
       </w:pPr>
       <w:r>
+        <w:rPr/>
         <w:t>Name: Sell</w:t>
-      </w:r>
-      <w:r>
         <w:tab/>
-      </w:r>
-      <w:r>
         <w:tab/>
-      </w:r>
-      <w:r>
         <w:tab/>
-      </w:r>
-      <w:r>
         <w:tab/>
-      </w:r>
-      <w:r>
         <w:tab/>
-      </w:r>
-      <w:r>
         <w:tab/>
         <w:t>Attended? NO</w:t>
       </w:r>
@@ -262,55 +290,53 @@
         </w:numPr>
         <w:rPr>
           <w:b/>
-          <w:bCs/>
-          <w:u w:val="single"/>
-        </w:rPr>
-      </w:pPr>
-      <w:r>
-        <w:t>Name: Khalid                                                                                    Attended? NO</w:t>
-      </w:r>
-    </w:p>
-    <w:p>
-      <w:pPr>
-        <w:jc w:val="center"/>
-        <w:rPr>
           <w:b/>
           <w:bCs/>
           <w:u w:val="single"/>
         </w:rPr>
       </w:pPr>
       <w:r>
-        <w:rPr>
+        <w:rPr/>
+        <w:t>Name: Khalid                                                                                    Attended? NO</w:t>
+      </w:r>
+    </w:p>
+    <w:p>
+      <w:pPr>
+        <w:pStyle w:val="Normal"/>
+        <w:jc w:val="center"/>
+        <w:rPr>
+          <w:b/>
           <w:b/>
           <w:bCs/>
           <w:u w:val="single"/>
         </w:rPr>
-        <w:t>Project Progress:</w:t>
-      </w:r>
-    </w:p>
-    <w:p>
-      <w:pPr>
+      </w:pPr>
+      <w:r>
         <w:rPr>
           <w:b/>
           <w:bCs/>
           <w:u w:val="single"/>
         </w:rPr>
-      </w:pPr>
-      <w:r>
-        <w:rPr>
+        <w:t>Project Progress:</w:t>
+      </w:r>
+    </w:p>
+    <w:p>
+      <w:pPr>
+        <w:pStyle w:val="Normal"/>
+        <w:rPr>
+          <w:b/>
           <w:b/>
           <w:bCs/>
           <w:u w:val="single"/>
         </w:rPr>
-        <w:t xml:space="preserve">Team Member (1): Name: </w:t>
-      </w:r>
+      </w:pPr>
       <w:r>
         <w:rPr>
           <w:b/>
           <w:bCs/>
           <w:u w:val="single"/>
         </w:rPr>
-        <w:t>Elysia</w:t>
+        <w:t>Team Member (1): Name: Elysia</w:t>
       </w:r>
     </w:p>
     <w:p>
@@ -320,28 +346,40 @@
           <w:ilvl w:val="0"/>
           <w:numId w:val="2"/>
         </w:numPr>
-      </w:pPr>
-      <w:r>
+        <w:rPr/>
+      </w:pPr>
+      <w:r>
+        <w:rPr/>
         <w:t>What did you accomplish yesterday?</w:t>
       </w:r>
     </w:p>
     <w:p>
       <w:pPr>
         <w:pStyle w:val="ListParagraph"/>
-      </w:pPr>
-      <w:r>
+        <w:rPr/>
+      </w:pPr>
+      <w:r>
+        <w:rPr/>
         <w:t>Answer:</w:t>
       </w:r>
     </w:p>
     <w:p>
       <w:pPr>
         <w:pStyle w:val="ListParagraph"/>
-      </w:pPr>
-    </w:p>
-    <w:p>
-      <w:pPr>
-        <w:pStyle w:val="ListParagraph"/>
-      </w:pPr>
+        <w:rPr/>
+      </w:pPr>
+      <w:r>
+        <w:rPr/>
+      </w:r>
+    </w:p>
+    <w:p>
+      <w:pPr>
+        <w:pStyle w:val="ListParagraph"/>
+        <w:rPr/>
+      </w:pPr>
+      <w:r>
+        <w:rPr/>
+      </w:r>
     </w:p>
     <w:p>
       <w:pPr>
@@ -350,28 +388,40 @@
           <w:ilvl w:val="0"/>
           <w:numId w:val="2"/>
         </w:numPr>
-      </w:pPr>
-      <w:r>
+        <w:rPr/>
+      </w:pPr>
+      <w:r>
+        <w:rPr/>
         <w:t>What will you do today?</w:t>
       </w:r>
     </w:p>
     <w:p>
       <w:pPr>
         <w:pStyle w:val="ListParagraph"/>
-      </w:pPr>
-      <w:r>
+        <w:rPr/>
+      </w:pPr>
+      <w:r>
+        <w:rPr/>
         <w:t>Answer:</w:t>
       </w:r>
     </w:p>
     <w:p>
       <w:pPr>
         <w:pStyle w:val="ListParagraph"/>
-      </w:pPr>
-    </w:p>
-    <w:p>
-      <w:pPr>
-        <w:pStyle w:val="ListParagraph"/>
-      </w:pPr>
+        <w:rPr/>
+      </w:pPr>
+      <w:r>
+        <w:rPr/>
+      </w:r>
+    </w:p>
+    <w:p>
+      <w:pPr>
+        <w:pStyle w:val="ListParagraph"/>
+        <w:rPr/>
+      </w:pPr>
+      <w:r>
+        <w:rPr/>
+      </w:r>
     </w:p>
     <w:p>
       <w:pPr>
@@ -380,37 +430,55 @@
           <w:ilvl w:val="0"/>
           <w:numId w:val="2"/>
         </w:numPr>
-      </w:pPr>
-      <w:r>
+        <w:rPr/>
+      </w:pPr>
+      <w:r>
+        <w:rPr/>
         <w:t>What obstacles are impeding your progress?</w:t>
       </w:r>
     </w:p>
     <w:p>
       <w:pPr>
         <w:pStyle w:val="ListParagraph"/>
-      </w:pPr>
-      <w:r>
+        <w:rPr/>
+      </w:pPr>
+      <w:r>
+        <w:rPr/>
         <w:t>Answer:</w:t>
       </w:r>
     </w:p>
     <w:p>
       <w:pPr>
         <w:pStyle w:val="ListParagraph"/>
-      </w:pPr>
-    </w:p>
-    <w:p>
-      <w:pPr>
-        <w:pStyle w:val="ListParagraph"/>
-      </w:pPr>
-    </w:p>
-    <w:p>
-      <w:pPr>
-        <w:pStyle w:val="ListParagraph"/>
-      </w:pPr>
-    </w:p>
-    <w:p>
-      <w:pPr>
-        <w:rPr>
+        <w:rPr/>
+      </w:pPr>
+      <w:r>
+        <w:rPr/>
+      </w:r>
+    </w:p>
+    <w:p>
+      <w:pPr>
+        <w:pStyle w:val="ListParagraph"/>
+        <w:rPr/>
+      </w:pPr>
+      <w:r>
+        <w:rPr/>
+      </w:r>
+    </w:p>
+    <w:p>
+      <w:pPr>
+        <w:pStyle w:val="ListParagraph"/>
+        <w:rPr/>
+      </w:pPr>
+      <w:r>
+        <w:rPr/>
+      </w:r>
+    </w:p>
+    <w:p>
+      <w:pPr>
+        <w:pStyle w:val="Normal"/>
+        <w:rPr>
+          <w:b/>
           <w:b/>
           <w:bCs/>
           <w:u w:val="single"/>
@@ -422,15 +490,7 @@
           <w:bCs/>
           <w:u w:val="single"/>
         </w:rPr>
-        <w:t xml:space="preserve">Team Member (2): Name: </w:t>
-      </w:r>
-      <w:r>
-        <w:rPr>
-          <w:b/>
-          <w:bCs/>
-          <w:u w:val="single"/>
-        </w:rPr>
-        <w:t>Lee</w:t>
+        <w:t>Team Member (2): Name: Lee</w:t>
       </w:r>
     </w:p>
     <w:p>
@@ -462,22 +522,21 @@
         <w:rPr>
           <w:lang w:val="en-US"/>
         </w:rPr>
-        <w:t xml:space="preserve">Answer: </w:t>
-      </w:r>
-      <w:r>
-        <w:rPr>
-          <w:lang w:val="en-US"/>
-        </w:rPr>
-        <w:t>Discussed with Gaia what’s left to do, delegated tasks; I will write the report and transfer all the daily standup meetings from Notion to separate documents.</w:t>
-      </w:r>
-    </w:p>
-    <w:p>
-      <w:pPr>
-        <w:pStyle w:val="ListParagraph"/>
-        <w:rPr>
-          <w:lang w:val="en-US"/>
-        </w:rPr>
-      </w:pPr>
+        <w:t>Answer: Discussed with Gaia what’s left to do, delegated tasks; I will write the report and transfer all the daily standup meetings from Notion to separate documents.</w:t>
+      </w:r>
+    </w:p>
+    <w:p>
+      <w:pPr>
+        <w:pStyle w:val="ListParagraph"/>
+        <w:rPr>
+          <w:lang w:val="en-US"/>
+        </w:rPr>
+      </w:pPr>
+      <w:r>
+        <w:rPr>
+          <w:lang w:val="en-US"/>
+        </w:rPr>
+      </w:r>
     </w:p>
     <w:p>
       <w:pPr>
@@ -508,28 +567,21 @@
         <w:rPr>
           <w:lang w:val="en-US"/>
         </w:rPr>
-        <w:t xml:space="preserve">Answer: </w:t>
-      </w:r>
-      <w:r>
-        <w:rPr>
-          <w:lang w:val="en-US"/>
-        </w:rPr>
-        <w:t>Finish writing report using bits Gaia and I have already written into our Notion pages. My job will now be to structure the report and write introduction and conclusion.</w:t>
-      </w:r>
-      <w:r>
-        <w:rPr>
-          <w:lang w:val="en-US"/>
-        </w:rPr>
-        <w:t xml:space="preserve"> Then work with Gaia on finishing up and getting the project submitted.</w:t>
-      </w:r>
-    </w:p>
-    <w:p>
-      <w:pPr>
-        <w:pStyle w:val="ListParagraph"/>
-        <w:rPr>
-          <w:lang w:val="en-US"/>
-        </w:rPr>
-      </w:pPr>
+        <w:t>Answer: Finish writing report using bits Gaia and I have already written into our Notion pages. My job will now be to structure the report and write introduction and conclusion. Then work with Gaia on finishing up and getting the project submitted.</w:t>
+      </w:r>
+    </w:p>
+    <w:p>
+      <w:pPr>
+        <w:pStyle w:val="ListParagraph"/>
+        <w:rPr>
+          <w:lang w:val="en-US"/>
+        </w:rPr>
+      </w:pPr>
+      <w:r>
+        <w:rPr>
+          <w:lang w:val="en-US"/>
+        </w:rPr>
+      </w:r>
     </w:p>
     <w:p>
       <w:pPr>
@@ -560,46 +612,63 @@
         <w:rPr>
           <w:lang w:val="en-US"/>
         </w:rPr>
-        <w:t xml:space="preserve">Answer: </w:t>
-      </w:r>
-      <w:r>
-        <w:rPr>
-          <w:lang w:val="en-US"/>
-        </w:rPr>
-        <w:t>The rest of the group needs to get their parts done.</w:t>
-      </w:r>
-    </w:p>
-    <w:p>
-      <w:pPr>
-        <w:pStyle w:val="ListParagraph"/>
-        <w:rPr>
-          <w:lang w:val="en-US"/>
-        </w:rPr>
-      </w:pPr>
-    </w:p>
-    <w:p>
-      <w:pPr>
-        <w:pStyle w:val="ListParagraph"/>
-      </w:pPr>
-    </w:p>
-    <w:p>
-      <w:pPr>
-        <w:pStyle w:val="ListParagraph"/>
-      </w:pPr>
-    </w:p>
-    <w:p>
-      <w:pPr>
-        <w:pStyle w:val="ListParagraph"/>
-      </w:pPr>
-    </w:p>
-    <w:p>
-      <w:pPr>
-        <w:pStyle w:val="ListParagraph"/>
-      </w:pPr>
-    </w:p>
-    <w:p>
-      <w:pPr>
-        <w:rPr>
+        <w:t>Answer: The rest of the group needs to get their parts done.</w:t>
+      </w:r>
+    </w:p>
+    <w:p>
+      <w:pPr>
+        <w:pStyle w:val="ListParagraph"/>
+        <w:rPr>
+          <w:lang w:val="en-US"/>
+        </w:rPr>
+      </w:pPr>
+      <w:r>
+        <w:rPr>
+          <w:lang w:val="en-US"/>
+        </w:rPr>
+      </w:r>
+    </w:p>
+    <w:p>
+      <w:pPr>
+        <w:pStyle w:val="ListParagraph"/>
+        <w:rPr/>
+      </w:pPr>
+      <w:r>
+        <w:rPr/>
+      </w:r>
+    </w:p>
+    <w:p>
+      <w:pPr>
+        <w:pStyle w:val="ListParagraph"/>
+        <w:rPr/>
+      </w:pPr>
+      <w:r>
+        <w:rPr/>
+      </w:r>
+    </w:p>
+    <w:p>
+      <w:pPr>
+        <w:pStyle w:val="ListParagraph"/>
+        <w:rPr/>
+      </w:pPr>
+      <w:r>
+        <w:rPr/>
+      </w:r>
+    </w:p>
+    <w:p>
+      <w:pPr>
+        <w:pStyle w:val="ListParagraph"/>
+        <w:rPr/>
+      </w:pPr>
+      <w:r>
+        <w:rPr/>
+      </w:r>
+    </w:p>
+    <w:p>
+      <w:pPr>
+        <w:pStyle w:val="Normal"/>
+        <w:rPr>
+          <w:b/>
           <w:b/>
           <w:bCs/>
           <w:u w:val="single"/>
@@ -611,15 +680,7 @@
           <w:bCs/>
           <w:u w:val="single"/>
         </w:rPr>
-        <w:t xml:space="preserve">Team Member (3): Name: </w:t>
-      </w:r>
-      <w:r>
-        <w:rPr>
-          <w:b/>
-          <w:bCs/>
-          <w:u w:val="single"/>
-        </w:rPr>
-        <w:t>Gaia</w:t>
+        <w:t>Team Member (3): Name: Gaia</w:t>
       </w:r>
     </w:p>
     <w:p>
@@ -653,14 +714,43 @@
         </w:rPr>
         <w:t xml:space="preserve">Answer: </w:t>
       </w:r>
-    </w:p>
-    <w:p>
-      <w:pPr>
-        <w:pStyle w:val="ListParagraph"/>
-        <w:rPr>
-          <w:lang w:val="en-US"/>
-        </w:rPr>
-      </w:pPr>
+      <w:r>
+        <w:rPr>
+          <w:lang w:val="en-US"/>
+        </w:rPr>
+        <w:t>Reviewed outstanding tasks with Lee ahead of the final submission. created new contact service and c</w:t>
+      </w:r>
+      <w:r>
+        <w:rPr/>
+        <w:t xml:space="preserve">ompleted the admin panel with tabbed navigation, contact enquiry management, and mark as read functionality. </w:t>
+      </w:r>
+      <w:r>
+        <w:rPr/>
+        <w:t>Added ai chatbot to contact page. And f</w:t>
+      </w:r>
+      <w:r>
+        <w:rPr/>
+        <w:t xml:space="preserve">inalised the </w:t>
+      </w:r>
+      <w:r>
+        <w:rPr/>
+        <w:t>header</w:t>
+      </w:r>
+      <w:r>
+        <w:rPr/>
+        <w:t xml:space="preserve"> shared component and wired navigation across the app. Updated the README with a two column screenshot grid ordered by user journey and a design sketches grid.</w:t>
+      </w:r>
+    </w:p>
+    <w:p>
+      <w:pPr>
+        <w:pStyle w:val="ListParagraph"/>
+        <w:rPr>
+          <w:lang w:val="en-US"/>
+        </w:rPr>
+      </w:pPr>
+      <w:r>
+        <w:rPr/>
+      </w:r>
     </w:p>
     <w:p>
       <w:pPr>
@@ -693,14 +783,23 @@
         </w:rPr>
         <w:t xml:space="preserve">Answer: </w:t>
       </w:r>
-    </w:p>
-    <w:p>
-      <w:pPr>
-        <w:pStyle w:val="ListParagraph"/>
-        <w:rPr>
-          <w:lang w:val="en-US"/>
-        </w:rPr>
-      </w:pPr>
+      <w:r>
+        <w:rPr/>
+        <w:t xml:space="preserve">Record the video demonstration. Final polish on the application and repo ahead of the submission deadline. Review Lee's completed report draft </w:t>
+      </w:r>
+    </w:p>
+    <w:p>
+      <w:pPr>
+        <w:pStyle w:val="ListParagraph"/>
+        <w:rPr>
+          <w:lang w:val="en-US"/>
+        </w:rPr>
+      </w:pPr>
+      <w:r>
+        <w:rPr>
+          <w:lang w:val="en-US"/>
+        </w:rPr>
+      </w:r>
     </w:p>
     <w:p>
       <w:pPr>
@@ -733,26 +832,31 @@
         </w:rPr>
         <w:t xml:space="preserve">Answer: </w:t>
       </w:r>
-    </w:p>
-    <w:p>
-      <w:pPr>
-        <w:pStyle w:val="ListParagraph"/>
-        <w:rPr>
-          <w:lang w:val="en-US"/>
-        </w:rPr>
-      </w:pPr>
-    </w:p>
-    <w:p>
-      <w:pPr>
-        <w:pStyle w:val="ListParagraph"/>
-        <w:rPr>
-          <w:lang w:val="en-US"/>
-        </w:rPr>
-      </w:pPr>
-    </w:p>
-    <w:p>
-      <w:pPr>
-        <w:rPr>
+      <w:r>
+        <w:rPr>
+          <w:lang w:val="en-US"/>
+        </w:rPr>
+        <w:t>database connection still pending. The admin panel currently uses a hardcoded password as a temporary measure which is  not ideal. this would be replaced with proper role based authentication once the database is connected</w:t>
+      </w:r>
+    </w:p>
+    <w:p>
+      <w:pPr>
+        <w:pStyle w:val="ListParagraph"/>
+        <w:rPr>
+          <w:lang w:val="en-US"/>
+        </w:rPr>
+      </w:pPr>
+      <w:r>
+        <w:rPr>
+          <w:lang w:val="en-US"/>
+        </w:rPr>
+      </w:r>
+    </w:p>
+    <w:p>
+      <w:pPr>
+        <w:pStyle w:val="Normal"/>
+        <w:rPr>
+          <w:b/>
           <w:b/>
           <w:bCs/>
           <w:u w:val="single"/>
@@ -764,15 +868,7 @@
           <w:bCs/>
           <w:u w:val="single"/>
         </w:rPr>
-        <w:t xml:space="preserve">Team Member (4): Name: </w:t>
-      </w:r>
-      <w:r>
-        <w:rPr>
-          <w:b/>
-          <w:bCs/>
-          <w:u w:val="single"/>
-        </w:rPr>
-        <w:t>Sell</w:t>
+        <w:t>Team Member (4): Name: Sell</w:t>
       </w:r>
     </w:p>
     <w:p>
@@ -782,23 +878,31 @@
           <w:ilvl w:val="0"/>
           <w:numId w:val="4"/>
         </w:numPr>
-      </w:pPr>
-      <w:r>
+        <w:rPr/>
+      </w:pPr>
+      <w:r>
+        <w:rPr/>
         <w:t>What did you accomplish yesterday?</w:t>
       </w:r>
     </w:p>
     <w:p>
       <w:pPr>
         <w:pStyle w:val="ListParagraph"/>
-      </w:pPr>
-      <w:r>
+        <w:rPr/>
+      </w:pPr>
+      <w:r>
+        <w:rPr/>
         <w:t xml:space="preserve">Answer: </w:t>
       </w:r>
     </w:p>
     <w:p>
       <w:pPr>
         <w:pStyle w:val="ListParagraph"/>
-      </w:pPr>
+        <w:rPr/>
+      </w:pPr>
+      <w:r>
+        <w:rPr/>
+      </w:r>
     </w:p>
     <w:p>
       <w:pPr>
@@ -807,23 +911,31 @@
           <w:ilvl w:val="0"/>
           <w:numId w:val="4"/>
         </w:numPr>
-      </w:pPr>
-      <w:r>
+        <w:rPr/>
+      </w:pPr>
+      <w:r>
+        <w:rPr/>
         <w:t>What will you do today?</w:t>
       </w:r>
     </w:p>
     <w:p>
       <w:pPr>
         <w:pStyle w:val="ListParagraph"/>
-      </w:pPr>
-      <w:r>
+        <w:rPr/>
+      </w:pPr>
+      <w:r>
+        <w:rPr/>
         <w:t xml:space="preserve">Answer: </w:t>
       </w:r>
     </w:p>
     <w:p>
       <w:pPr>
         <w:pStyle w:val="ListParagraph"/>
-      </w:pPr>
+        <w:rPr/>
+      </w:pPr>
+      <w:r>
+        <w:rPr/>
+      </w:r>
     </w:p>
     <w:p>
       <w:pPr>
@@ -832,23 +944,37 @@
           <w:ilvl w:val="0"/>
           <w:numId w:val="4"/>
         </w:numPr>
-      </w:pPr>
-      <w:r>
+        <w:rPr/>
+      </w:pPr>
+      <w:r>
+        <w:rPr/>
         <w:t>What obstacles are impeding your progress?</w:t>
       </w:r>
     </w:p>
     <w:p>
       <w:pPr>
         <w:pStyle w:val="ListParagraph"/>
-      </w:pPr>
-      <w:r>
+        <w:rPr/>
+      </w:pPr>
+      <w:r>
+        <w:rPr/>
         <w:t xml:space="preserve">Answer: </w:t>
       </w:r>
     </w:p>
-    <w:p/>
-    <w:p>
-      <w:pPr>
-        <w:rPr>
+    <w:p>
+      <w:pPr>
+        <w:pStyle w:val="Normal"/>
+        <w:rPr/>
+      </w:pPr>
+      <w:r>
+        <w:rPr/>
+      </w:r>
+    </w:p>
+    <w:p>
+      <w:pPr>
+        <w:pStyle w:val="Normal"/>
+        <w:rPr>
+          <w:b/>
           <w:b/>
           <w:bCs/>
           <w:u w:val="single"/>
@@ -860,31 +986,7 @@
           <w:bCs/>
           <w:u w:val="single"/>
         </w:rPr>
-        <w:t>Team Member (</w:t>
-      </w:r>
-      <w:r>
-        <w:rPr>
-          <w:b/>
-          <w:bCs/>
-          <w:u w:val="single"/>
-        </w:rPr>
-        <w:t>5</w:t>
-      </w:r>
-      <w:r>
-        <w:rPr>
-          <w:b/>
-          <w:bCs/>
-          <w:u w:val="single"/>
-        </w:rPr>
-        <w:t xml:space="preserve">): Name: </w:t>
-      </w:r>
-      <w:r>
-        <w:rPr>
-          <w:b/>
-          <w:bCs/>
-          <w:u w:val="single"/>
-        </w:rPr>
-        <w:t>Khalid</w:t>
+        <w:t>Team Member (5): Name: Khalid</w:t>
       </w:r>
     </w:p>
     <w:p>
@@ -894,28 +996,40 @@
           <w:ilvl w:val="0"/>
           <w:numId w:val="3"/>
         </w:numPr>
-      </w:pPr>
-      <w:r>
+        <w:rPr/>
+      </w:pPr>
+      <w:r>
+        <w:rPr/>
         <w:t>What did you accomplish yesterday?</w:t>
       </w:r>
     </w:p>
     <w:p>
       <w:pPr>
         <w:pStyle w:val="ListParagraph"/>
-      </w:pPr>
-      <w:r>
+        <w:rPr/>
+      </w:pPr>
+      <w:r>
+        <w:rPr/>
         <w:t>Answer:</w:t>
       </w:r>
     </w:p>
     <w:p>
       <w:pPr>
         <w:pStyle w:val="ListParagraph"/>
-      </w:pPr>
-    </w:p>
-    <w:p>
-      <w:pPr>
-        <w:pStyle w:val="ListParagraph"/>
-      </w:pPr>
+        <w:rPr/>
+      </w:pPr>
+      <w:r>
+        <w:rPr/>
+      </w:r>
+    </w:p>
+    <w:p>
+      <w:pPr>
+        <w:pStyle w:val="ListParagraph"/>
+        <w:rPr/>
+      </w:pPr>
+      <w:r>
+        <w:rPr/>
+      </w:r>
     </w:p>
     <w:p>
       <w:pPr>
@@ -924,28 +1038,40 @@
           <w:ilvl w:val="0"/>
           <w:numId w:val="3"/>
         </w:numPr>
-      </w:pPr>
-      <w:r>
+        <w:rPr/>
+      </w:pPr>
+      <w:r>
+        <w:rPr/>
         <w:t>What will you do today?</w:t>
       </w:r>
     </w:p>
     <w:p>
       <w:pPr>
         <w:pStyle w:val="ListParagraph"/>
-      </w:pPr>
-      <w:r>
+        <w:rPr/>
+      </w:pPr>
+      <w:r>
+        <w:rPr/>
         <w:t>Answer:</w:t>
       </w:r>
     </w:p>
     <w:p>
       <w:pPr>
         <w:pStyle w:val="ListParagraph"/>
-      </w:pPr>
-    </w:p>
-    <w:p>
-      <w:pPr>
-        <w:pStyle w:val="ListParagraph"/>
-      </w:pPr>
+        <w:rPr/>
+      </w:pPr>
+      <w:r>
+        <w:rPr/>
+      </w:r>
+    </w:p>
+    <w:p>
+      <w:pPr>
+        <w:pStyle w:val="ListParagraph"/>
+        <w:rPr/>
+      </w:pPr>
+      <w:r>
+        <w:rPr/>
+      </w:r>
     </w:p>
     <w:p>
       <w:pPr>
@@ -954,29 +1080,47 @@
           <w:ilvl w:val="0"/>
           <w:numId w:val="3"/>
         </w:numPr>
-      </w:pPr>
-      <w:r>
+        <w:rPr/>
+      </w:pPr>
+      <w:r>
+        <w:rPr/>
         <w:t>What obstacles are impeding your progress?</w:t>
       </w:r>
     </w:p>
     <w:p>
       <w:pPr>
         <w:pStyle w:val="ListParagraph"/>
-      </w:pPr>
-      <w:r>
+        <w:rPr/>
+      </w:pPr>
+      <w:r>
+        <w:rPr/>
         <w:t>Answer:</w:t>
       </w:r>
     </w:p>
     <w:p>
       <w:pPr>
         <w:pStyle w:val="ListParagraph"/>
-      </w:pPr>
-    </w:p>
-    <w:p/>
-    <w:p>
-      <w:pPr>
+        <w:rPr/>
+      </w:pPr>
+      <w:r>
+        <w:rPr/>
+      </w:r>
+    </w:p>
+    <w:p>
+      <w:pPr>
+        <w:pStyle w:val="Normal"/>
+        <w:rPr/>
+      </w:pPr>
+      <w:r>
+        <w:rPr/>
+      </w:r>
+    </w:p>
+    <w:p>
+      <w:pPr>
+        <w:pStyle w:val="Normal"/>
         <w:jc w:val="center"/>
         <w:rPr>
+          <w:i/>
           <w:i/>
           <w:iCs/>
           <w:sz w:val="28"/>
@@ -992,7 +1136,7 @@
           <w:sz w:val="28"/>
           <w:szCs w:val="28"/>
         </w:rPr>
-        <w:t>“Alone we can do so little; together we can do so much.” – Helen Kelle</w:t>
+        <w:t>“</w:t>
       </w:r>
       <w:r>
         <w:rPr>
@@ -1003,62 +1147,80 @@
           <w:sz w:val="28"/>
           <w:szCs w:val="28"/>
         </w:rPr>
-        <w:t>r</w:t>
-      </w:r>
-    </w:p>
-    <w:p/>
-    <w:p/>
+        <w:t>Alone we can do so little; together we can do so much.” – Helen Keller</w:t>
+      </w:r>
+    </w:p>
+    <w:p>
+      <w:pPr>
+        <w:pStyle w:val="Normal"/>
+        <w:rPr/>
+      </w:pPr>
+      <w:r>
+        <w:rPr/>
+      </w:r>
+    </w:p>
+    <w:p>
+      <w:pPr>
+        <w:pStyle w:val="Normal"/>
+        <w:widowControl/>
+        <w:bidi w:val="0"/>
+        <w:spacing w:lineRule="auto" w:line="259" w:before="0" w:after="160"/>
+        <w:jc w:val="left"/>
+        <w:rPr/>
+      </w:pPr>
+      <w:r>
+        <w:rPr/>
+      </w:r>
+    </w:p>
     <w:sectPr>
-      <w:footerReference w:type="default" r:id="rId5"/>
+      <w:footerReference w:type="default" r:id="rId2"/>
+      <w:type w:val="nextPage"/>
       <w:pgSz w:w="11906" w:h="16838"/>
-      <w:pgMar w:top="1440" w:right="1440" w:bottom="1440" w:left="1440" w:header="708" w:footer="708" w:gutter="0"/>
-      <w:cols w:space="708"/>
-      <w:docGrid w:linePitch="360"/>
+      <w:pgMar w:left="1440" w:right="1440" w:gutter="0" w:header="0" w:top="1440" w:footer="708" w:bottom="1440"/>
+      <w:pgNumType w:fmt="decimal"/>
+      <w:formProt w:val="false"/>
+      <w:textDirection w:val="lrTb"/>
+      <w:docGrid w:type="default" w:linePitch="360" w:charSpace="0"/>
     </w:sectPr>
   </w:body>
 </w:document>
 </file>
 
 <file path=word/footer1.xml><?xml version="1.0" encoding="utf-8"?>
-<w:ftr xmlns:wpc="http://schemas.microsoft.com/office/word/2010/wordprocessingCanvas" xmlns:cx="http://schemas.microsoft.com/office/drawing/2014/chartex" xmlns:cx1="http://schemas.microsoft.com/office/drawing/2015/9/8/chartex" xmlns:cx2="http://schemas.microsoft.com/office/drawing/2015/10/21/chartex" xmlns:cx3="http://schemas.microsoft.com/office/drawing/2016/5/9/chartex" xmlns:cx4="http://schemas.microsoft.com/office/drawing/2016/5/10/chartex" xmlns:cx5="http://schemas.microsoft.com/office/drawing/2016/5/11/chartex" xmlns:cx6="http://schemas.microsoft.com/office/drawing/2016/5/12/chartex" xmlns:cx7="http://schemas.microsoft.com/office/drawing/2016/5/13/chartex" xmlns:cx8="http://schemas.microsoft.com/office/drawing/2016/5/14/chartex" xmlns:mc="http://schemas.openxmlformats.org/markup-compatibility/2006" xmlns:aink="http://schemas.microsoft.com/office/drawing/2016/ink" xmlns:am3d="http://schemas.microsoft.com/office/drawing/2017/model3d" xmlns:o="urn:schemas-microsoft-com:office:office" xmlns:oel="http://schemas.microsoft.com/office/2019/extlst" xmlns:r="http://schemas.openxmlformats.org/officeDocument/2006/relationships" xmlns:m="http://schemas.openxmlformats.org/officeDocument/2006/math" xmlns:v="urn:schemas-microsoft-com:vml" xmlns:wp14="http://schemas.microsoft.com/office/word/2010/wordprocessingDrawing" xmlns:wp="http://schemas.openxmlformats.org/drawingml/2006/wordprocessingDrawing" xmlns:w10="urn:schemas-microsoft-com:office:word" xmlns:w="http://schemas.openxmlformats.org/wordprocessingml/2006/main" xmlns:w14="http://schemas.microsoft.com/office/word/2010/wordml" xmlns:w15="http://schemas.microsoft.com/office/word/2012/wordml" xmlns:w16cex="http://schemas.microsoft.com/office/word/2018/wordml/cex" xmlns:w16cid="http://schemas.microsoft.com/office/word/2016/wordml/cid" xmlns:w16="http://schemas.microsoft.com/office/word/2018/wordml" xmlns:w16du="http://schemas.microsoft.com/office/word/2023/wordml/word16du" xmlns:w16sdtdh="http://schemas.microsoft.com/office/word/2020/wordml/sdtdatahash" xmlns:w16sdtfl="http://schemas.microsoft.com/office/word/2024/wordml/sdtformatlock" xmlns:w16se="http://schemas.microsoft.com/office/word/2015/wordml/symex" xmlns:wpg="http://schemas.microsoft.com/office/word/2010/wordprocessingGroup" xmlns:wpi="http://schemas.microsoft.com/office/word/2010/wordprocessingInk" xmlns:wne="http://schemas.microsoft.com/office/word/2006/wordml" xmlns:wps="http://schemas.microsoft.com/office/word/2010/wordprocessingShape" mc:Ignorable="w14 w15 w16se w16cid w16 w16cex w16sdtdh w16sdtfl w16du wp14">
+<w:ftr xmlns:o="urn:schemas-microsoft-com:office:office" xmlns:r="http://schemas.openxmlformats.org/officeDocument/2006/relationships" xmlns:v="urn:schemas-microsoft-com:vml" xmlns:w="http://schemas.openxmlformats.org/wordprocessingml/2006/main" xmlns:w10="urn:schemas-microsoft-com:office:word" xmlns:wp="http://schemas.openxmlformats.org/drawingml/2006/wordprocessingDrawing" xmlns:wps="http://schemas.microsoft.com/office/word/2010/wordprocessingShape" xmlns:wpg="http://schemas.microsoft.com/office/word/2010/wordprocessingGroup" xmlns:mc="http://schemas.openxmlformats.org/markup-compatibility/2006" xmlns:wp14="http://schemas.microsoft.com/office/word/2010/wordprocessingDrawing" xmlns:w14="http://schemas.microsoft.com/office/word/2010/wordml" xmlns:w15="http://schemas.microsoft.com/office/word/2012/wordml" mc:Ignorable="w14 wp14 w15">
   <w:sdt>
     <w:sdtPr>
-      <w:id w:val="-1569265574"/>
       <w:docPartObj>
         <w:docPartGallery w:val="Page Numbers (Bottom of Page)"/>
-        <w:docPartUnique/>
+        <w:docPartUnique w:val="true"/>
       </w:docPartObj>
+      <w:id w:val="523751379"/>
     </w:sdtPr>
-    <w:sdtEndPr>
-      <w:rPr>
-        <w:noProof/>
-      </w:rPr>
-    </w:sdtEndPr>
     <w:sdtContent>
       <w:p>
         <w:pPr>
           <w:pStyle w:val="Footer"/>
           <w:jc w:val="center"/>
+          <w:rPr/>
         </w:pPr>
         <w:r>
+          <w:rPr/>
           <w:fldChar w:fldCharType="begin"/>
         </w:r>
         <w:r>
-          <w:instrText xml:space="preserve"> PAGE   \* MERGEFORMAT </w:instrText>
+          <w:rPr/>
+          <w:instrText xml:space="preserve"> PAGE </w:instrText>
         </w:r>
         <w:r>
+          <w:rPr/>
           <w:fldChar w:fldCharType="separate"/>
         </w:r>
         <w:r>
-          <w:rPr>
-            <w:noProof/>
-          </w:rPr>
-          <w:t>2</w:t>
+          <w:rPr/>
+          <w:t>3</w:t>
         </w:r>
         <w:r>
-          <w:rPr>
-            <w:noProof/>
-          </w:rPr>
+          <w:rPr/>
           <w:fldChar w:fldCharType="end"/>
         </w:r>
       </w:p>
@@ -1067,328 +1229,274 @@
   <w:p>
     <w:pPr>
       <w:pStyle w:val="Footer"/>
+      <w:rPr/>
     </w:pPr>
+    <w:r>
+      <w:rPr/>
+    </w:r>
   </w:p>
 </w:ftr>
 </file>
 
 <file path=word/numbering.xml><?xml version="1.0" encoding="utf-8"?>
-<w:numbering xmlns:wpc="http://schemas.microsoft.com/office/word/2010/wordprocessingCanvas" xmlns:cx="http://schemas.microsoft.com/office/drawing/2014/chartex" xmlns:cx1="http://schemas.microsoft.com/office/drawing/2015/9/8/chartex" xmlns:cx2="http://schemas.microsoft.com/office/drawing/2015/10/21/chartex" xmlns:cx3="http://schemas.microsoft.com/office/drawing/2016/5/9/chartex" xmlns:cx4="http://schemas.microsoft.com/office/drawing/2016/5/10/chartex" xmlns:cx5="http://schemas.microsoft.com/office/drawing/2016/5/11/chartex" xmlns:cx6="http://schemas.microsoft.com/office/drawing/2016/5/12/chartex" xmlns:cx7="http://schemas.microsoft.com/office/drawing/2016/5/13/chartex" xmlns:cx8="http://schemas.microsoft.com/office/drawing/2016/5/14/chartex" xmlns:mc="http://schemas.openxmlformats.org/markup-compatibility/2006" xmlns:aink="http://schemas.microsoft.com/office/drawing/2016/ink" xmlns:am3d="http://schemas.microsoft.com/office/drawing/2017/model3d" xmlns:o="urn:schemas-microsoft-com:office:office" xmlns:oel="http://schemas.microsoft.com/office/2019/extlst" xmlns:r="http://schemas.openxmlformats.org/officeDocument/2006/relationships" xmlns:m="http://schemas.openxmlformats.org/officeDocument/2006/math" xmlns:v="urn:schemas-microsoft-com:vml" xmlns:wp14="http://schemas.microsoft.com/office/word/2010/wordprocessingDrawing" xmlns:wp="http://schemas.openxmlformats.org/drawingml/2006/wordprocessingDrawing" xmlns:w10="urn:schemas-microsoft-com:office:word" xmlns:w="http://schemas.openxmlformats.org/wordprocessingml/2006/main" xmlns:w14="http://schemas.microsoft.com/office/word/2010/wordml" xmlns:w15="http://schemas.microsoft.com/office/word/2012/wordml" xmlns:w16cex="http://schemas.microsoft.com/office/word/2018/wordml/cex" xmlns:w16cid="http://schemas.microsoft.com/office/word/2016/wordml/cid" xmlns:w16="http://schemas.microsoft.com/office/word/2018/wordml" xmlns:w16du="http://schemas.microsoft.com/office/word/2023/wordml/word16du" xmlns:w16sdtdh="http://schemas.microsoft.com/office/word/2020/wordml/sdtdatahash" xmlns:w16sdtfl="http://schemas.microsoft.com/office/word/2024/wordml/sdtformatlock" xmlns:w16se="http://schemas.microsoft.com/office/word/2015/wordml/symex" xmlns:wpg="http://schemas.microsoft.com/office/word/2010/wordprocessingGroup" xmlns:wpi="http://schemas.microsoft.com/office/word/2010/wordprocessingInk" xmlns:wne="http://schemas.microsoft.com/office/word/2006/wordml" xmlns:wps="http://schemas.microsoft.com/office/word/2010/wordprocessingShape" mc:Ignorable="w14 w15 w16se w16cid w16 w16cex w16sdtdh w16sdtfl w16du wp14">
-  <w:abstractNum w:abstractNumId="0" w15:restartNumberingAfterBreak="0">
-    <w:nsid w:val="2768711C"/>
-    <w:multiLevelType w:val="multilevel"/>
-    <w:tmpl w:val="37B0EA54"/>
+<w:numbering xmlns:w="http://schemas.openxmlformats.org/wordprocessingml/2006/main" xmlns:o="urn:schemas-microsoft-com:office:office" xmlns:r="http://schemas.openxmlformats.org/officeDocument/2006/relationships" xmlns:v="urn:schemas-microsoft-com:vml" xmlns:mc="http://schemas.openxmlformats.org/markup-compatibility/2006" xmlns:w14="http://schemas.microsoft.com/office/word/2010/wordml" mc:Ignorable="w14">
+  <w:abstractNum w:abstractNumId="1">
     <w:lvl w:ilvl="0">
-      <w:start w:val="1"/>
-      <w:numFmt w:val="decimal"/>
-      <w:lvlText w:val="%1."/>
-      <w:lvlJc w:val="left"/>
-      <w:pPr>
-        <w:tabs>
-          <w:tab w:val="num" w:pos="720"/>
-        </w:tabs>
-        <w:ind w:left="720" w:hanging="360"/>
-      </w:pPr>
-    </w:lvl>
-    <w:lvl w:ilvl="1" w:tentative="1">
-      <w:start w:val="1"/>
-      <w:numFmt w:val="decimal"/>
-      <w:lvlText w:val="%2."/>
-      <w:lvlJc w:val="left"/>
-      <w:pPr>
-        <w:tabs>
-          <w:tab w:val="num" w:pos="1440"/>
-        </w:tabs>
-        <w:ind w:left="1440" w:hanging="360"/>
-      </w:pPr>
-    </w:lvl>
-    <w:lvl w:ilvl="2" w:tentative="1">
-      <w:start w:val="1"/>
-      <w:numFmt w:val="decimal"/>
-      <w:lvlText w:val="%3."/>
-      <w:lvlJc w:val="left"/>
-      <w:pPr>
-        <w:tabs>
-          <w:tab w:val="num" w:pos="2160"/>
-        </w:tabs>
-        <w:ind w:left="2160" w:hanging="360"/>
-      </w:pPr>
-    </w:lvl>
-    <w:lvl w:ilvl="3" w:tentative="1">
-      <w:start w:val="1"/>
-      <w:numFmt w:val="decimal"/>
-      <w:lvlText w:val="%4."/>
-      <w:lvlJc w:val="left"/>
-      <w:pPr>
-        <w:tabs>
-          <w:tab w:val="num" w:pos="2880"/>
-        </w:tabs>
-        <w:ind w:left="2880" w:hanging="360"/>
-      </w:pPr>
-    </w:lvl>
-    <w:lvl w:ilvl="4" w:tentative="1">
-      <w:start w:val="1"/>
-      <w:numFmt w:val="decimal"/>
-      <w:lvlText w:val="%5."/>
-      <w:lvlJc w:val="left"/>
-      <w:pPr>
-        <w:tabs>
-          <w:tab w:val="num" w:pos="3600"/>
-        </w:tabs>
-        <w:ind w:left="3600" w:hanging="360"/>
-      </w:pPr>
-    </w:lvl>
-    <w:lvl w:ilvl="5" w:tentative="1">
-      <w:start w:val="1"/>
-      <w:numFmt w:val="decimal"/>
-      <w:lvlText w:val="%6."/>
-      <w:lvlJc w:val="left"/>
-      <w:pPr>
-        <w:tabs>
-          <w:tab w:val="num" w:pos="4320"/>
-        </w:tabs>
-        <w:ind w:left="4320" w:hanging="360"/>
-      </w:pPr>
-    </w:lvl>
-    <w:lvl w:ilvl="6" w:tentative="1">
-      <w:start w:val="1"/>
-      <w:numFmt w:val="decimal"/>
-      <w:lvlText w:val="%7."/>
-      <w:lvlJc w:val="left"/>
-      <w:pPr>
-        <w:tabs>
-          <w:tab w:val="num" w:pos="5040"/>
-        </w:tabs>
-        <w:ind w:left="5040" w:hanging="360"/>
-      </w:pPr>
-    </w:lvl>
-    <w:lvl w:ilvl="7" w:tentative="1">
-      <w:start w:val="1"/>
-      <w:numFmt w:val="decimal"/>
-      <w:lvlText w:val="%8."/>
-      <w:lvlJc w:val="left"/>
-      <w:pPr>
-        <w:tabs>
-          <w:tab w:val="num" w:pos="5760"/>
-        </w:tabs>
-        <w:ind w:left="5760" w:hanging="360"/>
-      </w:pPr>
-    </w:lvl>
-    <w:lvl w:ilvl="8" w:tentative="1">
-      <w:start w:val="1"/>
-      <w:numFmt w:val="decimal"/>
-      <w:lvlText w:val="%9."/>
-      <w:lvlJc w:val="left"/>
-      <w:pPr>
-        <w:tabs>
-          <w:tab w:val="num" w:pos="6480"/>
-        </w:tabs>
-        <w:ind w:left="6480" w:hanging="360"/>
-      </w:pPr>
-    </w:lvl>
-  </w:abstractNum>
-  <w:abstractNum w:abstractNumId="1" w15:restartNumberingAfterBreak="0">
-    <w:nsid w:val="335A45FA"/>
-    <w:multiLevelType w:val="hybridMultilevel"/>
-    <w:tmpl w:val="DD42BDC8"/>
-    <w:lvl w:ilvl="0" w:tplc="DFF2F086">
       <w:numFmt w:val="bullet"/>
       <w:lvlText w:val=""/>
       <w:lvlJc w:val="left"/>
       <w:pPr>
+        <w:tabs>
+          <w:tab w:val="num" w:pos="0"/>
+        </w:tabs>
         <w:ind w:left="720" w:hanging="360"/>
       </w:pPr>
       <w:rPr>
-        <w:rFonts w:ascii="Symbol" w:eastAsiaTheme="minorHAnsi" w:hAnsi="Symbol" w:cstheme="minorBidi" w:hint="default"/>
+        <w:rFonts w:ascii="Symbol" w:hAnsi="Symbol" w:cs="Symbol" w:hint="default"/>
+        <w:rFonts w:cstheme="minorBidi" w:eastAsiaTheme="minorHAnsi"/>
       </w:rPr>
     </w:lvl>
-    <w:lvl w:ilvl="1" w:tplc="08090003" w:tentative="1">
+    <w:lvl w:ilvl="1">
       <w:start w:val="1"/>
       <w:numFmt w:val="bullet"/>
       <w:lvlText w:val="o"/>
       <w:lvlJc w:val="left"/>
       <w:pPr>
+        <w:tabs>
+          <w:tab w:val="num" w:pos="0"/>
+        </w:tabs>
         <w:ind w:left="1440" w:hanging="360"/>
       </w:pPr>
       <w:rPr>
         <w:rFonts w:ascii="Courier New" w:hAnsi="Courier New" w:cs="Courier New" w:hint="default"/>
       </w:rPr>
     </w:lvl>
-    <w:lvl w:ilvl="2" w:tplc="08090005" w:tentative="1">
+    <w:lvl w:ilvl="2">
       <w:start w:val="1"/>
       <w:numFmt w:val="bullet"/>
       <w:lvlText w:val=""/>
       <w:lvlJc w:val="left"/>
       <w:pPr>
+        <w:tabs>
+          <w:tab w:val="num" w:pos="0"/>
+        </w:tabs>
         <w:ind w:left="2160" w:hanging="360"/>
       </w:pPr>
       <w:rPr>
-        <w:rFonts w:ascii="Wingdings" w:hAnsi="Wingdings" w:hint="default"/>
+        <w:rFonts w:ascii="Wingdings" w:hAnsi="Wingdings" w:cs="Wingdings" w:hint="default"/>
       </w:rPr>
     </w:lvl>
-    <w:lvl w:ilvl="3" w:tplc="08090001" w:tentative="1">
+    <w:lvl w:ilvl="3">
       <w:start w:val="1"/>
       <w:numFmt w:val="bullet"/>
       <w:lvlText w:val=""/>
       <w:lvlJc w:val="left"/>
       <w:pPr>
+        <w:tabs>
+          <w:tab w:val="num" w:pos="0"/>
+        </w:tabs>
         <w:ind w:left="2880" w:hanging="360"/>
       </w:pPr>
       <w:rPr>
-        <w:rFonts w:ascii="Symbol" w:hAnsi="Symbol" w:hint="default"/>
+        <w:rFonts w:ascii="Symbol" w:hAnsi="Symbol" w:cs="Symbol" w:hint="default"/>
       </w:rPr>
     </w:lvl>
-    <w:lvl w:ilvl="4" w:tplc="08090003" w:tentative="1">
+    <w:lvl w:ilvl="4">
       <w:start w:val="1"/>
       <w:numFmt w:val="bullet"/>
       <w:lvlText w:val="o"/>
       <w:lvlJc w:val="left"/>
       <w:pPr>
+        <w:tabs>
+          <w:tab w:val="num" w:pos="0"/>
+        </w:tabs>
         <w:ind w:left="3600" w:hanging="360"/>
       </w:pPr>
       <w:rPr>
         <w:rFonts w:ascii="Courier New" w:hAnsi="Courier New" w:cs="Courier New" w:hint="default"/>
       </w:rPr>
     </w:lvl>
-    <w:lvl w:ilvl="5" w:tplc="08090005" w:tentative="1">
+    <w:lvl w:ilvl="5">
       <w:start w:val="1"/>
       <w:numFmt w:val="bullet"/>
       <w:lvlText w:val=""/>
       <w:lvlJc w:val="left"/>
       <w:pPr>
+        <w:tabs>
+          <w:tab w:val="num" w:pos="0"/>
+        </w:tabs>
         <w:ind w:left="4320" w:hanging="360"/>
       </w:pPr>
       <w:rPr>
-        <w:rFonts w:ascii="Wingdings" w:hAnsi="Wingdings" w:hint="default"/>
+        <w:rFonts w:ascii="Wingdings" w:hAnsi="Wingdings" w:cs="Wingdings" w:hint="default"/>
       </w:rPr>
     </w:lvl>
-    <w:lvl w:ilvl="6" w:tplc="08090001" w:tentative="1">
+    <w:lvl w:ilvl="6">
       <w:start w:val="1"/>
       <w:numFmt w:val="bullet"/>
       <w:lvlText w:val=""/>
       <w:lvlJc w:val="left"/>
       <w:pPr>
+        <w:tabs>
+          <w:tab w:val="num" w:pos="0"/>
+        </w:tabs>
         <w:ind w:left="5040" w:hanging="360"/>
       </w:pPr>
       <w:rPr>
-        <w:rFonts w:ascii="Symbol" w:hAnsi="Symbol" w:hint="default"/>
+        <w:rFonts w:ascii="Symbol" w:hAnsi="Symbol" w:cs="Symbol" w:hint="default"/>
       </w:rPr>
     </w:lvl>
-    <w:lvl w:ilvl="7" w:tplc="08090003" w:tentative="1">
+    <w:lvl w:ilvl="7">
       <w:start w:val="1"/>
       <w:numFmt w:val="bullet"/>
       <w:lvlText w:val="o"/>
       <w:lvlJc w:val="left"/>
       <w:pPr>
+        <w:tabs>
+          <w:tab w:val="num" w:pos="0"/>
+        </w:tabs>
         <w:ind w:left="5760" w:hanging="360"/>
       </w:pPr>
       <w:rPr>
         <w:rFonts w:ascii="Courier New" w:hAnsi="Courier New" w:cs="Courier New" w:hint="default"/>
       </w:rPr>
     </w:lvl>
-    <w:lvl w:ilvl="8" w:tplc="08090005" w:tentative="1">
+    <w:lvl w:ilvl="8">
       <w:start w:val="1"/>
       <w:numFmt w:val="bullet"/>
       <w:lvlText w:val=""/>
       <w:lvlJc w:val="left"/>
       <w:pPr>
+        <w:tabs>
+          <w:tab w:val="num" w:pos="0"/>
+        </w:tabs>
         <w:ind w:left="6480" w:hanging="360"/>
       </w:pPr>
       <w:rPr>
-        <w:rFonts w:ascii="Wingdings" w:hAnsi="Wingdings" w:hint="default"/>
+        <w:rFonts w:ascii="Wingdings" w:hAnsi="Wingdings" w:cs="Wingdings" w:hint="default"/>
       </w:rPr>
     </w:lvl>
   </w:abstractNum>
-  <w:abstractNum w:abstractNumId="2" w15:restartNumberingAfterBreak="0">
-    <w:nsid w:val="4D8950E5"/>
-    <w:multiLevelType w:val="hybridMultilevel"/>
-    <w:tmpl w:val="69B854E8"/>
-    <w:lvl w:ilvl="0" w:tplc="0809000F">
+  <w:abstractNum w:abstractNumId="2">
+    <w:lvl w:ilvl="0">
       <w:start w:val="1"/>
       <w:numFmt w:val="decimal"/>
       <w:lvlText w:val="%1."/>
       <w:lvlJc w:val="left"/>
       <w:pPr>
+        <w:tabs>
+          <w:tab w:val="num" w:pos="0"/>
+        </w:tabs>
         <w:ind w:left="720" w:hanging="360"/>
       </w:pPr>
-    </w:lvl>
-    <w:lvl w:ilvl="1" w:tplc="08090019" w:tentative="1">
+      <w:rPr/>
+    </w:lvl>
+    <w:lvl w:ilvl="1">
       <w:start w:val="1"/>
       <w:numFmt w:val="lowerLetter"/>
       <w:lvlText w:val="%2."/>
       <w:lvlJc w:val="left"/>
       <w:pPr>
+        <w:tabs>
+          <w:tab w:val="num" w:pos="0"/>
+        </w:tabs>
         <w:ind w:left="1440" w:hanging="360"/>
       </w:pPr>
-    </w:lvl>
-    <w:lvl w:ilvl="2" w:tplc="0809001B" w:tentative="1">
+      <w:rPr/>
+    </w:lvl>
+    <w:lvl w:ilvl="2">
       <w:start w:val="1"/>
       <w:numFmt w:val="lowerRoman"/>
       <w:lvlText w:val="%3."/>
       <w:lvlJc w:val="right"/>
       <w:pPr>
+        <w:tabs>
+          <w:tab w:val="num" w:pos="0"/>
+        </w:tabs>
         <w:ind w:left="2160" w:hanging="180"/>
       </w:pPr>
-    </w:lvl>
-    <w:lvl w:ilvl="3" w:tplc="0809000F" w:tentative="1">
+      <w:rPr/>
+    </w:lvl>
+    <w:lvl w:ilvl="3">
       <w:start w:val="1"/>
       <w:numFmt w:val="decimal"/>
       <w:lvlText w:val="%4."/>
       <w:lvlJc w:val="left"/>
       <w:pPr>
+        <w:tabs>
+          <w:tab w:val="num" w:pos="0"/>
+        </w:tabs>
         <w:ind w:left="2880" w:hanging="360"/>
       </w:pPr>
-    </w:lvl>
-    <w:lvl w:ilvl="4" w:tplc="08090019" w:tentative="1">
+      <w:rPr/>
+    </w:lvl>
+    <w:lvl w:ilvl="4">
       <w:start w:val="1"/>
       <w:numFmt w:val="lowerLetter"/>
       <w:lvlText w:val="%5."/>
       <w:lvlJc w:val="left"/>
       <w:pPr>
+        <w:tabs>
+          <w:tab w:val="num" w:pos="0"/>
+        </w:tabs>
         <w:ind w:left="3600" w:hanging="360"/>
       </w:pPr>
-    </w:lvl>
-    <w:lvl w:ilvl="5" w:tplc="0809001B" w:tentative="1">
+      <w:rPr/>
+    </w:lvl>
+    <w:lvl w:ilvl="5">
       <w:start w:val="1"/>
       <w:numFmt w:val="lowerRoman"/>
       <w:lvlText w:val="%6."/>
       <w:lvlJc w:val="right"/>
       <w:pPr>
+        <w:tabs>
+          <w:tab w:val="num" w:pos="0"/>
+        </w:tabs>
         <w:ind w:left="4320" w:hanging="180"/>
       </w:pPr>
-    </w:lvl>
-    <w:lvl w:ilvl="6" w:tplc="0809000F" w:tentative="1">
+      <w:rPr/>
+    </w:lvl>
+    <w:lvl w:ilvl="6">
       <w:start w:val="1"/>
       <w:numFmt w:val="decimal"/>
       <w:lvlText w:val="%7."/>
       <w:lvlJc w:val="left"/>
       <w:pPr>
+        <w:tabs>
+          <w:tab w:val="num" w:pos="0"/>
+        </w:tabs>
         <w:ind w:left="5040" w:hanging="360"/>
       </w:pPr>
-    </w:lvl>
-    <w:lvl w:ilvl="7" w:tplc="08090019" w:tentative="1">
+      <w:rPr/>
+    </w:lvl>
+    <w:lvl w:ilvl="7">
       <w:start w:val="1"/>
       <w:numFmt w:val="lowerLetter"/>
       <w:lvlText w:val="%8."/>
       <w:lvlJc w:val="left"/>
       <w:pPr>
+        <w:tabs>
+          <w:tab w:val="num" w:pos="0"/>
+        </w:tabs>
         <w:ind w:left="5760" w:hanging="360"/>
       </w:pPr>
-    </w:lvl>
-    <w:lvl w:ilvl="8" w:tplc="0809001B" w:tentative="1">
+      <w:rPr/>
+    </w:lvl>
+    <w:lvl w:ilvl="8">
       <w:start w:val="1"/>
       <w:numFmt w:val="lowerRoman"/>
       <w:lvlText w:val="%9."/>
       <w:lvlJc w:val="right"/>
       <w:pPr>
+        <w:tabs>
+          <w:tab w:val="num" w:pos="0"/>
+        </w:tabs>
         <w:ind w:left="6480" w:hanging="180"/>
       </w:pPr>
+      <w:rPr/>
     </w:lvl>
   </w:abstractNum>
-  <w:abstractNum w:abstractNumId="3" w15:restartNumberingAfterBreak="0">
-    <w:nsid w:val="5C432EDB"/>
-    <w:multiLevelType w:val="multilevel"/>
-    <w:tmpl w:val="A970DABE"/>
+  <w:abstractNum w:abstractNumId="3">
     <w:lvl w:ilvl="0">
       <w:start w:val="1"/>
       <w:numFmt w:val="decimal"/>
@@ -1396,310 +1504,623 @@
       <w:lvlJc w:val="left"/>
       <w:pPr>
         <w:tabs>
-          <w:tab w:val="num" w:pos="720"/>
+          <w:tab w:val="num" w:pos="0"/>
         </w:tabs>
         <w:ind w:left="720" w:hanging="360"/>
       </w:pPr>
-    </w:lvl>
-    <w:lvl w:ilvl="1" w:tentative="1">
-      <w:start w:val="1"/>
-      <w:numFmt w:val="decimal"/>
-      <w:lvlText w:val="%2."/>
-      <w:lvlJc w:val="left"/>
-      <w:pPr>
-        <w:tabs>
-          <w:tab w:val="num" w:pos="1440"/>
-        </w:tabs>
-        <w:ind w:left="1440" w:hanging="360"/>
-      </w:pPr>
-    </w:lvl>
-    <w:lvl w:ilvl="2" w:tentative="1">
-      <w:start w:val="1"/>
-      <w:numFmt w:val="decimal"/>
-      <w:lvlText w:val="%3."/>
-      <w:lvlJc w:val="left"/>
-      <w:pPr>
-        <w:tabs>
-          <w:tab w:val="num" w:pos="2160"/>
-        </w:tabs>
-        <w:ind w:left="2160" w:hanging="360"/>
-      </w:pPr>
-    </w:lvl>
-    <w:lvl w:ilvl="3" w:tentative="1">
-      <w:start w:val="1"/>
-      <w:numFmt w:val="decimal"/>
-      <w:lvlText w:val="%4."/>
-      <w:lvlJc w:val="left"/>
-      <w:pPr>
-        <w:tabs>
-          <w:tab w:val="num" w:pos="2880"/>
-        </w:tabs>
-        <w:ind w:left="2880" w:hanging="360"/>
-      </w:pPr>
-    </w:lvl>
-    <w:lvl w:ilvl="4" w:tentative="1">
-      <w:start w:val="1"/>
-      <w:numFmt w:val="decimal"/>
-      <w:lvlText w:val="%5."/>
-      <w:lvlJc w:val="left"/>
-      <w:pPr>
-        <w:tabs>
-          <w:tab w:val="num" w:pos="3600"/>
-        </w:tabs>
-        <w:ind w:left="3600" w:hanging="360"/>
-      </w:pPr>
-    </w:lvl>
-    <w:lvl w:ilvl="5" w:tentative="1">
-      <w:start w:val="1"/>
-      <w:numFmt w:val="decimal"/>
-      <w:lvlText w:val="%6."/>
-      <w:lvlJc w:val="left"/>
-      <w:pPr>
-        <w:tabs>
-          <w:tab w:val="num" w:pos="4320"/>
-        </w:tabs>
-        <w:ind w:left="4320" w:hanging="360"/>
-      </w:pPr>
-    </w:lvl>
-    <w:lvl w:ilvl="6" w:tentative="1">
-      <w:start w:val="1"/>
-      <w:numFmt w:val="decimal"/>
-      <w:lvlText w:val="%7."/>
-      <w:lvlJc w:val="left"/>
-      <w:pPr>
-        <w:tabs>
-          <w:tab w:val="num" w:pos="5040"/>
-        </w:tabs>
-        <w:ind w:left="5040" w:hanging="360"/>
-      </w:pPr>
-    </w:lvl>
-    <w:lvl w:ilvl="7" w:tentative="1">
-      <w:start w:val="1"/>
-      <w:numFmt w:val="decimal"/>
-      <w:lvlText w:val="%8."/>
-      <w:lvlJc w:val="left"/>
-      <w:pPr>
-        <w:tabs>
-          <w:tab w:val="num" w:pos="5760"/>
-        </w:tabs>
-        <w:ind w:left="5760" w:hanging="360"/>
-      </w:pPr>
-    </w:lvl>
-    <w:lvl w:ilvl="8" w:tentative="1">
-      <w:start w:val="1"/>
-      <w:numFmt w:val="decimal"/>
-      <w:lvlText w:val="%9."/>
-      <w:lvlJc w:val="left"/>
-      <w:pPr>
-        <w:tabs>
-          <w:tab w:val="num" w:pos="6480"/>
-        </w:tabs>
-        <w:ind w:left="6480" w:hanging="360"/>
-      </w:pPr>
-    </w:lvl>
-  </w:abstractNum>
-  <w:abstractNum w:abstractNumId="4" w15:restartNumberingAfterBreak="0">
-    <w:nsid w:val="6F6713F5"/>
-    <w:multiLevelType w:val="hybridMultilevel"/>
-    <w:tmpl w:val="95C64778"/>
-    <w:lvl w:ilvl="0" w:tplc="0409000F">
-      <w:start w:val="1"/>
-      <w:numFmt w:val="decimal"/>
-      <w:lvlText w:val="%1."/>
-      <w:lvlJc w:val="left"/>
-      <w:pPr>
-        <w:ind w:left="720" w:hanging="360"/>
-      </w:pPr>
-      <w:rPr>
-        <w:rFonts w:hint="default"/>
-      </w:rPr>
-    </w:lvl>
-    <w:lvl w:ilvl="1" w:tplc="04090019" w:tentative="1">
+      <w:rPr/>
+    </w:lvl>
+    <w:lvl w:ilvl="1">
       <w:start w:val="1"/>
       <w:numFmt w:val="lowerLetter"/>
       <w:lvlText w:val="%2."/>
       <w:lvlJc w:val="left"/>
       <w:pPr>
+        <w:tabs>
+          <w:tab w:val="num" w:pos="0"/>
+        </w:tabs>
         <w:ind w:left="1440" w:hanging="360"/>
       </w:pPr>
-    </w:lvl>
-    <w:lvl w:ilvl="2" w:tplc="0409001B" w:tentative="1">
+      <w:rPr/>
+    </w:lvl>
+    <w:lvl w:ilvl="2">
       <w:start w:val="1"/>
       <w:numFmt w:val="lowerRoman"/>
       <w:lvlText w:val="%3."/>
       <w:lvlJc w:val="right"/>
       <w:pPr>
+        <w:tabs>
+          <w:tab w:val="num" w:pos="0"/>
+        </w:tabs>
         <w:ind w:left="2160" w:hanging="180"/>
       </w:pPr>
-    </w:lvl>
-    <w:lvl w:ilvl="3" w:tplc="0409000F" w:tentative="1">
+      <w:rPr/>
+    </w:lvl>
+    <w:lvl w:ilvl="3">
       <w:start w:val="1"/>
       <w:numFmt w:val="decimal"/>
       <w:lvlText w:val="%4."/>
       <w:lvlJc w:val="left"/>
       <w:pPr>
+        <w:tabs>
+          <w:tab w:val="num" w:pos="0"/>
+        </w:tabs>
         <w:ind w:left="2880" w:hanging="360"/>
       </w:pPr>
-    </w:lvl>
-    <w:lvl w:ilvl="4" w:tplc="04090019" w:tentative="1">
+      <w:rPr/>
+    </w:lvl>
+    <w:lvl w:ilvl="4">
       <w:start w:val="1"/>
       <w:numFmt w:val="lowerLetter"/>
       <w:lvlText w:val="%5."/>
       <w:lvlJc w:val="left"/>
       <w:pPr>
+        <w:tabs>
+          <w:tab w:val="num" w:pos="0"/>
+        </w:tabs>
         <w:ind w:left="3600" w:hanging="360"/>
       </w:pPr>
-    </w:lvl>
-    <w:lvl w:ilvl="5" w:tplc="0409001B" w:tentative="1">
+      <w:rPr/>
+    </w:lvl>
+    <w:lvl w:ilvl="5">
       <w:start w:val="1"/>
       <w:numFmt w:val="lowerRoman"/>
       <w:lvlText w:val="%6."/>
       <w:lvlJc w:val="right"/>
       <w:pPr>
+        <w:tabs>
+          <w:tab w:val="num" w:pos="0"/>
+        </w:tabs>
         <w:ind w:left="4320" w:hanging="180"/>
       </w:pPr>
-    </w:lvl>
-    <w:lvl w:ilvl="6" w:tplc="0409000F" w:tentative="1">
+      <w:rPr/>
+    </w:lvl>
+    <w:lvl w:ilvl="6">
       <w:start w:val="1"/>
       <w:numFmt w:val="decimal"/>
       <w:lvlText w:val="%7."/>
       <w:lvlJc w:val="left"/>
       <w:pPr>
+        <w:tabs>
+          <w:tab w:val="num" w:pos="0"/>
+        </w:tabs>
         <w:ind w:left="5040" w:hanging="360"/>
       </w:pPr>
-    </w:lvl>
-    <w:lvl w:ilvl="7" w:tplc="04090019" w:tentative="1">
+      <w:rPr/>
+    </w:lvl>
+    <w:lvl w:ilvl="7">
       <w:start w:val="1"/>
       <w:numFmt w:val="lowerLetter"/>
       <w:lvlText w:val="%8."/>
       <w:lvlJc w:val="left"/>
       <w:pPr>
+        <w:tabs>
+          <w:tab w:val="num" w:pos="0"/>
+        </w:tabs>
         <w:ind w:left="5760" w:hanging="360"/>
       </w:pPr>
-    </w:lvl>
-    <w:lvl w:ilvl="8" w:tplc="0409001B" w:tentative="1">
+      <w:rPr/>
+    </w:lvl>
+    <w:lvl w:ilvl="8">
       <w:start w:val="1"/>
       <w:numFmt w:val="lowerRoman"/>
       <w:lvlText w:val="%9."/>
       <w:lvlJc w:val="right"/>
       <w:pPr>
+        <w:tabs>
+          <w:tab w:val="num" w:pos="0"/>
+        </w:tabs>
         <w:ind w:left="6480" w:hanging="180"/>
       </w:pPr>
+      <w:rPr/>
     </w:lvl>
   </w:abstractNum>
-  <w:abstractNum w:abstractNumId="5" w15:restartNumberingAfterBreak="0">
-    <w:nsid w:val="77745E7F"/>
-    <w:multiLevelType w:val="hybridMultilevel"/>
-    <w:tmpl w:val="69B854E8"/>
-    <w:lvl w:ilvl="0" w:tplc="FFFFFFFF">
+  <w:abstractNum w:abstractNumId="4">
+    <w:lvl w:ilvl="0">
       <w:start w:val="1"/>
       <w:numFmt w:val="decimal"/>
       <w:lvlText w:val="%1."/>
       <w:lvlJc w:val="left"/>
       <w:pPr>
+        <w:tabs>
+          <w:tab w:val="num" w:pos="0"/>
+        </w:tabs>
         <w:ind w:left="720" w:hanging="360"/>
       </w:pPr>
-    </w:lvl>
-    <w:lvl w:ilvl="1" w:tplc="FFFFFFFF" w:tentative="1">
+      <w:rPr/>
+    </w:lvl>
+    <w:lvl w:ilvl="1">
       <w:start w:val="1"/>
       <w:numFmt w:val="lowerLetter"/>
       <w:lvlText w:val="%2."/>
       <w:lvlJc w:val="left"/>
       <w:pPr>
+        <w:tabs>
+          <w:tab w:val="num" w:pos="0"/>
+        </w:tabs>
         <w:ind w:left="1440" w:hanging="360"/>
       </w:pPr>
-    </w:lvl>
-    <w:lvl w:ilvl="2" w:tplc="FFFFFFFF" w:tentative="1">
+      <w:rPr/>
+    </w:lvl>
+    <w:lvl w:ilvl="2">
       <w:start w:val="1"/>
       <w:numFmt w:val="lowerRoman"/>
       <w:lvlText w:val="%3."/>
       <w:lvlJc w:val="right"/>
       <w:pPr>
+        <w:tabs>
+          <w:tab w:val="num" w:pos="0"/>
+        </w:tabs>
         <w:ind w:left="2160" w:hanging="180"/>
       </w:pPr>
-    </w:lvl>
-    <w:lvl w:ilvl="3" w:tplc="FFFFFFFF" w:tentative="1">
+      <w:rPr/>
+    </w:lvl>
+    <w:lvl w:ilvl="3">
       <w:start w:val="1"/>
       <w:numFmt w:val="decimal"/>
       <w:lvlText w:val="%4."/>
       <w:lvlJc w:val="left"/>
       <w:pPr>
+        <w:tabs>
+          <w:tab w:val="num" w:pos="0"/>
+        </w:tabs>
         <w:ind w:left="2880" w:hanging="360"/>
       </w:pPr>
-    </w:lvl>
-    <w:lvl w:ilvl="4" w:tplc="FFFFFFFF" w:tentative="1">
+      <w:rPr/>
+    </w:lvl>
+    <w:lvl w:ilvl="4">
       <w:start w:val="1"/>
       <w:numFmt w:val="lowerLetter"/>
       <w:lvlText w:val="%5."/>
       <w:lvlJc w:val="left"/>
       <w:pPr>
+        <w:tabs>
+          <w:tab w:val="num" w:pos="0"/>
+        </w:tabs>
         <w:ind w:left="3600" w:hanging="360"/>
       </w:pPr>
-    </w:lvl>
-    <w:lvl w:ilvl="5" w:tplc="FFFFFFFF" w:tentative="1">
+      <w:rPr/>
+    </w:lvl>
+    <w:lvl w:ilvl="5">
       <w:start w:val="1"/>
       <w:numFmt w:val="lowerRoman"/>
       <w:lvlText w:val="%6."/>
       <w:lvlJc w:val="right"/>
       <w:pPr>
+        <w:tabs>
+          <w:tab w:val="num" w:pos="0"/>
+        </w:tabs>
         <w:ind w:left="4320" w:hanging="180"/>
       </w:pPr>
-    </w:lvl>
-    <w:lvl w:ilvl="6" w:tplc="FFFFFFFF" w:tentative="1">
+      <w:rPr/>
+    </w:lvl>
+    <w:lvl w:ilvl="6">
       <w:start w:val="1"/>
       <w:numFmt w:val="decimal"/>
       <w:lvlText w:val="%7."/>
       <w:lvlJc w:val="left"/>
       <w:pPr>
+        <w:tabs>
+          <w:tab w:val="num" w:pos="0"/>
+        </w:tabs>
         <w:ind w:left="5040" w:hanging="360"/>
       </w:pPr>
-    </w:lvl>
-    <w:lvl w:ilvl="7" w:tplc="FFFFFFFF" w:tentative="1">
+      <w:rPr/>
+    </w:lvl>
+    <w:lvl w:ilvl="7">
       <w:start w:val="1"/>
       <w:numFmt w:val="lowerLetter"/>
       <w:lvlText w:val="%8."/>
       <w:lvlJc w:val="left"/>
       <w:pPr>
+        <w:tabs>
+          <w:tab w:val="num" w:pos="0"/>
+        </w:tabs>
         <w:ind w:left="5760" w:hanging="360"/>
       </w:pPr>
-    </w:lvl>
-    <w:lvl w:ilvl="8" w:tplc="FFFFFFFF" w:tentative="1">
+      <w:rPr/>
+    </w:lvl>
+    <w:lvl w:ilvl="8">
       <w:start w:val="1"/>
       <w:numFmt w:val="lowerRoman"/>
       <w:lvlText w:val="%9."/>
       <w:lvlJc w:val="right"/>
       <w:pPr>
+        <w:tabs>
+          <w:tab w:val="num" w:pos="0"/>
+        </w:tabs>
         <w:ind w:left="6480" w:hanging="180"/>
       </w:pPr>
+      <w:rPr/>
     </w:lvl>
   </w:abstractNum>
-  <w:num w:numId="1" w16cid:durableId="1813324637">
+  <w:abstractNum w:abstractNumId="5">
+    <w:lvl w:ilvl="0">
+      <w:start w:val="1"/>
+      <w:numFmt w:val="decimal"/>
+      <w:lvlText w:val="%1."/>
+      <w:lvlJc w:val="left"/>
+      <w:pPr>
+        <w:tabs>
+          <w:tab w:val="num" w:pos="720"/>
+        </w:tabs>
+        <w:ind w:left="720" w:hanging="360"/>
+      </w:pPr>
+      <w:rPr/>
+    </w:lvl>
+    <w:lvl w:ilvl="1">
+      <w:start w:val="1"/>
+      <w:numFmt w:val="decimal"/>
+      <w:lvlText w:val="%2."/>
+      <w:lvlJc w:val="left"/>
+      <w:pPr>
+        <w:tabs>
+          <w:tab w:val="num" w:pos="1440"/>
+        </w:tabs>
+        <w:ind w:left="1440" w:hanging="360"/>
+      </w:pPr>
+      <w:rPr/>
+    </w:lvl>
+    <w:lvl w:ilvl="2">
+      <w:start w:val="1"/>
+      <w:numFmt w:val="decimal"/>
+      <w:lvlText w:val="%3."/>
+      <w:lvlJc w:val="left"/>
+      <w:pPr>
+        <w:tabs>
+          <w:tab w:val="num" w:pos="2160"/>
+        </w:tabs>
+        <w:ind w:left="2160" w:hanging="360"/>
+      </w:pPr>
+      <w:rPr/>
+    </w:lvl>
+    <w:lvl w:ilvl="3">
+      <w:start w:val="1"/>
+      <w:numFmt w:val="decimal"/>
+      <w:lvlText w:val="%4."/>
+      <w:lvlJc w:val="left"/>
+      <w:pPr>
+        <w:tabs>
+          <w:tab w:val="num" w:pos="2880"/>
+        </w:tabs>
+        <w:ind w:left="2880" w:hanging="360"/>
+      </w:pPr>
+      <w:rPr/>
+    </w:lvl>
+    <w:lvl w:ilvl="4">
+      <w:start w:val="1"/>
+      <w:numFmt w:val="decimal"/>
+      <w:lvlText w:val="%5."/>
+      <w:lvlJc w:val="left"/>
+      <w:pPr>
+        <w:tabs>
+          <w:tab w:val="num" w:pos="3600"/>
+        </w:tabs>
+        <w:ind w:left="3600" w:hanging="360"/>
+      </w:pPr>
+      <w:rPr/>
+    </w:lvl>
+    <w:lvl w:ilvl="5">
+      <w:start w:val="1"/>
+      <w:numFmt w:val="decimal"/>
+      <w:lvlText w:val="%6."/>
+      <w:lvlJc w:val="left"/>
+      <w:pPr>
+        <w:tabs>
+          <w:tab w:val="num" w:pos="4320"/>
+        </w:tabs>
+        <w:ind w:left="4320" w:hanging="360"/>
+      </w:pPr>
+      <w:rPr/>
+    </w:lvl>
+    <w:lvl w:ilvl="6">
+      <w:start w:val="1"/>
+      <w:numFmt w:val="decimal"/>
+      <w:lvlText w:val="%7."/>
+      <w:lvlJc w:val="left"/>
+      <w:pPr>
+        <w:tabs>
+          <w:tab w:val="num" w:pos="5040"/>
+        </w:tabs>
+        <w:ind w:left="5040" w:hanging="360"/>
+      </w:pPr>
+      <w:rPr/>
+    </w:lvl>
+    <w:lvl w:ilvl="7">
+      <w:start w:val="1"/>
+      <w:numFmt w:val="decimal"/>
+      <w:lvlText w:val="%8."/>
+      <w:lvlJc w:val="left"/>
+      <w:pPr>
+        <w:tabs>
+          <w:tab w:val="num" w:pos="5760"/>
+        </w:tabs>
+        <w:ind w:left="5760" w:hanging="360"/>
+      </w:pPr>
+      <w:rPr/>
+    </w:lvl>
+    <w:lvl w:ilvl="8">
+      <w:start w:val="1"/>
+      <w:numFmt w:val="decimal"/>
+      <w:lvlText w:val="%9."/>
+      <w:lvlJc w:val="left"/>
+      <w:pPr>
+        <w:tabs>
+          <w:tab w:val="num" w:pos="6480"/>
+        </w:tabs>
+        <w:ind w:left="6480" w:hanging="360"/>
+      </w:pPr>
+      <w:rPr/>
+    </w:lvl>
+  </w:abstractNum>
+  <w:abstractNum w:abstractNumId="6">
+    <w:lvl w:ilvl="0">
+      <w:start w:val="1"/>
+      <w:numFmt w:val="decimal"/>
+      <w:lvlText w:val="%1."/>
+      <w:lvlJc w:val="left"/>
+      <w:pPr>
+        <w:tabs>
+          <w:tab w:val="num" w:pos="720"/>
+        </w:tabs>
+        <w:ind w:left="720" w:hanging="360"/>
+      </w:pPr>
+      <w:rPr/>
+    </w:lvl>
+    <w:lvl w:ilvl="1">
+      <w:start w:val="1"/>
+      <w:numFmt w:val="decimal"/>
+      <w:lvlText w:val="%2."/>
+      <w:lvlJc w:val="left"/>
+      <w:pPr>
+        <w:tabs>
+          <w:tab w:val="num" w:pos="1440"/>
+        </w:tabs>
+        <w:ind w:left="1440" w:hanging="360"/>
+      </w:pPr>
+      <w:rPr/>
+    </w:lvl>
+    <w:lvl w:ilvl="2">
+      <w:start w:val="1"/>
+      <w:numFmt w:val="decimal"/>
+      <w:lvlText w:val="%3."/>
+      <w:lvlJc w:val="left"/>
+      <w:pPr>
+        <w:tabs>
+          <w:tab w:val="num" w:pos="2160"/>
+        </w:tabs>
+        <w:ind w:left="2160" w:hanging="360"/>
+      </w:pPr>
+      <w:rPr/>
+    </w:lvl>
+    <w:lvl w:ilvl="3">
+      <w:start w:val="1"/>
+      <w:numFmt w:val="decimal"/>
+      <w:lvlText w:val="%4."/>
+      <w:lvlJc w:val="left"/>
+      <w:pPr>
+        <w:tabs>
+          <w:tab w:val="num" w:pos="2880"/>
+        </w:tabs>
+        <w:ind w:left="2880" w:hanging="360"/>
+      </w:pPr>
+      <w:rPr/>
+    </w:lvl>
+    <w:lvl w:ilvl="4">
+      <w:start w:val="1"/>
+      <w:numFmt w:val="decimal"/>
+      <w:lvlText w:val="%5."/>
+      <w:lvlJc w:val="left"/>
+      <w:pPr>
+        <w:tabs>
+          <w:tab w:val="num" w:pos="3600"/>
+        </w:tabs>
+        <w:ind w:left="3600" w:hanging="360"/>
+      </w:pPr>
+      <w:rPr/>
+    </w:lvl>
+    <w:lvl w:ilvl="5">
+      <w:start w:val="1"/>
+      <w:numFmt w:val="decimal"/>
+      <w:lvlText w:val="%6."/>
+      <w:lvlJc w:val="left"/>
+      <w:pPr>
+        <w:tabs>
+          <w:tab w:val="num" w:pos="4320"/>
+        </w:tabs>
+        <w:ind w:left="4320" w:hanging="360"/>
+      </w:pPr>
+      <w:rPr/>
+    </w:lvl>
+    <w:lvl w:ilvl="6">
+      <w:start w:val="1"/>
+      <w:numFmt w:val="decimal"/>
+      <w:lvlText w:val="%7."/>
+      <w:lvlJc w:val="left"/>
+      <w:pPr>
+        <w:tabs>
+          <w:tab w:val="num" w:pos="5040"/>
+        </w:tabs>
+        <w:ind w:left="5040" w:hanging="360"/>
+      </w:pPr>
+      <w:rPr/>
+    </w:lvl>
+    <w:lvl w:ilvl="7">
+      <w:start w:val="1"/>
+      <w:numFmt w:val="decimal"/>
+      <w:lvlText w:val="%8."/>
+      <w:lvlJc w:val="left"/>
+      <w:pPr>
+        <w:tabs>
+          <w:tab w:val="num" w:pos="5760"/>
+        </w:tabs>
+        <w:ind w:left="5760" w:hanging="360"/>
+      </w:pPr>
+      <w:rPr/>
+    </w:lvl>
+    <w:lvl w:ilvl="8">
+      <w:start w:val="1"/>
+      <w:numFmt w:val="decimal"/>
+      <w:lvlText w:val="%9."/>
+      <w:lvlJc w:val="left"/>
+      <w:pPr>
+        <w:tabs>
+          <w:tab w:val="num" w:pos="6480"/>
+        </w:tabs>
+        <w:ind w:left="6480" w:hanging="360"/>
+      </w:pPr>
+      <w:rPr/>
+    </w:lvl>
+  </w:abstractNum>
+  <w:abstractNum w:abstractNumId="7">
+    <w:lvl w:ilvl="0">
+      <w:start w:val="1"/>
+      <w:numFmt w:val="none"/>
+      <w:suff w:val="nothing"/>
+      <w:lvlText w:val=""/>
+      <w:lvlJc w:val="left"/>
+      <w:pPr>
+        <w:tabs>
+          <w:tab w:val="num" w:pos="0"/>
+        </w:tabs>
+        <w:ind w:left="0" w:hanging="0"/>
+      </w:pPr>
+    </w:lvl>
+    <w:lvl w:ilvl="1">
+      <w:start w:val="1"/>
+      <w:numFmt w:val="none"/>
+      <w:suff w:val="nothing"/>
+      <w:lvlText w:val=""/>
+      <w:lvlJc w:val="left"/>
+      <w:pPr>
+        <w:tabs>
+          <w:tab w:val="num" w:pos="0"/>
+        </w:tabs>
+        <w:ind w:left="0" w:hanging="0"/>
+      </w:pPr>
+    </w:lvl>
+    <w:lvl w:ilvl="2">
+      <w:start w:val="1"/>
+      <w:numFmt w:val="none"/>
+      <w:suff w:val="nothing"/>
+      <w:lvlText w:val=""/>
+      <w:lvlJc w:val="left"/>
+      <w:pPr>
+        <w:tabs>
+          <w:tab w:val="num" w:pos="0"/>
+        </w:tabs>
+        <w:ind w:left="0" w:hanging="0"/>
+      </w:pPr>
+    </w:lvl>
+    <w:lvl w:ilvl="3">
+      <w:start w:val="1"/>
+      <w:numFmt w:val="none"/>
+      <w:suff w:val="nothing"/>
+      <w:lvlText w:val=""/>
+      <w:lvlJc w:val="left"/>
+      <w:pPr>
+        <w:tabs>
+          <w:tab w:val="num" w:pos="0"/>
+        </w:tabs>
+        <w:ind w:left="0" w:hanging="0"/>
+      </w:pPr>
+    </w:lvl>
+    <w:lvl w:ilvl="4">
+      <w:start w:val="1"/>
+      <w:numFmt w:val="none"/>
+      <w:suff w:val="nothing"/>
+      <w:lvlText w:val=""/>
+      <w:lvlJc w:val="left"/>
+      <w:pPr>
+        <w:tabs>
+          <w:tab w:val="num" w:pos="0"/>
+        </w:tabs>
+        <w:ind w:left="0" w:hanging="0"/>
+      </w:pPr>
+    </w:lvl>
+    <w:lvl w:ilvl="5">
+      <w:start w:val="1"/>
+      <w:numFmt w:val="none"/>
+      <w:suff w:val="nothing"/>
+      <w:lvlText w:val=""/>
+      <w:lvlJc w:val="left"/>
+      <w:pPr>
+        <w:tabs>
+          <w:tab w:val="num" w:pos="0"/>
+        </w:tabs>
+        <w:ind w:left="0" w:hanging="0"/>
+      </w:pPr>
+    </w:lvl>
+    <w:lvl w:ilvl="6">
+      <w:start w:val="1"/>
+      <w:numFmt w:val="none"/>
+      <w:suff w:val="nothing"/>
+      <w:lvlText w:val=""/>
+      <w:lvlJc w:val="left"/>
+      <w:pPr>
+        <w:tabs>
+          <w:tab w:val="num" w:pos="0"/>
+        </w:tabs>
+        <w:ind w:left="0" w:hanging="0"/>
+      </w:pPr>
+    </w:lvl>
+    <w:lvl w:ilvl="7">
+      <w:start w:val="1"/>
+      <w:numFmt w:val="none"/>
+      <w:suff w:val="nothing"/>
+      <w:lvlText w:val=""/>
+      <w:lvlJc w:val="left"/>
+      <w:pPr>
+        <w:tabs>
+          <w:tab w:val="num" w:pos="0"/>
+        </w:tabs>
+        <w:ind w:left="0" w:hanging="0"/>
+      </w:pPr>
+    </w:lvl>
+    <w:lvl w:ilvl="8">
+      <w:start w:val="1"/>
+      <w:numFmt w:val="none"/>
+      <w:suff w:val="nothing"/>
+      <w:lvlText w:val=""/>
+      <w:lvlJc w:val="left"/>
+      <w:pPr>
+        <w:tabs>
+          <w:tab w:val="num" w:pos="0"/>
+        </w:tabs>
+        <w:ind w:left="0" w:hanging="0"/>
+      </w:pPr>
+    </w:lvl>
+  </w:abstractNum>
+  <w:num w:numId="1">
     <w:abstractNumId w:val="1"/>
   </w:num>
-  <w:num w:numId="2" w16cid:durableId="2014448311">
+  <w:num w:numId="2">
     <w:abstractNumId w:val="2"/>
   </w:num>
-  <w:num w:numId="3" w16cid:durableId="1987313732">
+  <w:num w:numId="3">
+    <w:abstractNumId w:val="3"/>
+  </w:num>
+  <w:num w:numId="4">
+    <w:abstractNumId w:val="4"/>
+  </w:num>
+  <w:num w:numId="5">
     <w:abstractNumId w:val="5"/>
   </w:num>
-  <w:num w:numId="4" w16cid:durableId="1621691380">
-    <w:abstractNumId w:val="4"/>
+  <w:num w:numId="6">
+    <w:abstractNumId w:val="6"/>
   </w:num>
-  <w:num w:numId="5" w16cid:durableId="380175045">
-    <w:abstractNumId w:val="0"/>
-  </w:num>
-  <w:num w:numId="6" w16cid:durableId="622031658">
-    <w:abstractNumId w:val="3"/>
+  <w:num w:numId="7">
+    <w:abstractNumId w:val="7"/>
   </w:num>
 </w:numbering>
 </file>
 
 <file path=word/styles.xml><?xml version="1.0" encoding="utf-8"?>
-<w:styles xmlns:mc="http://schemas.openxmlformats.org/markup-compatibility/2006" xmlns:r="http://schemas.openxmlformats.org/officeDocument/2006/relationships" xmlns:w="http://schemas.openxmlformats.org/wordprocessingml/2006/main" xmlns:w14="http://schemas.microsoft.com/office/word/2010/wordml" xmlns:w15="http://schemas.microsoft.com/office/word/2012/wordml" xmlns:w16cex="http://schemas.microsoft.com/office/word/2018/wordml/cex" xmlns:w16cid="http://schemas.microsoft.com/office/word/2016/wordml/cid" xmlns:w16="http://schemas.microsoft.com/office/word/2018/wordml" xmlns:w16du="http://schemas.microsoft.com/office/word/2023/wordml/word16du" xmlns:w16sdtdh="http://schemas.microsoft.com/office/word/2020/wordml/sdtdatahash" xmlns:w16sdtfl="http://schemas.microsoft.com/office/word/2024/wordml/sdtformatlock" xmlns:w16se="http://schemas.microsoft.com/office/word/2015/wordml/symex" mc:Ignorable="w14 w15 w16se w16cid w16 w16cex w16sdtdh w16sdtfl w16du">
+<w:styles xmlns:w="http://schemas.openxmlformats.org/wordprocessingml/2006/main" xmlns:w14="http://schemas.microsoft.com/office/word/2010/wordml" xmlns:mc="http://schemas.openxmlformats.org/markup-compatibility/2006" mc:Ignorable="w14">
   <w:docDefaults>
     <w:rPrDefault>
       <w:rPr>
-        <w:rFonts w:asciiTheme="minorHAnsi" w:eastAsiaTheme="minorHAnsi" w:hAnsiTheme="minorHAnsi" w:cstheme="minorBidi"/>
+        <w:rFonts w:ascii="Aptos" w:hAnsi="Aptos" w:eastAsia="Aptos" w:cs="" w:asciiTheme="minorHAnsi" w:cstheme="minorBidi" w:eastAsiaTheme="minorHAnsi" w:hAnsiTheme="minorHAnsi"/>
         <w:kern w:val="2"/>
         <w:sz w:val="24"/>
         <w:szCs w:val="24"/>
@@ -1709,21 +2130,21 @@
     </w:rPrDefault>
     <w:pPrDefault>
       <w:pPr>
-        <w:spacing w:after="160" w:line="278" w:lineRule="auto"/>
+        <w:suppressAutoHyphens w:val="true"/>
       </w:pPr>
     </w:pPrDefault>
   </w:docDefaults>
   <w:latentStyles w:defLockedState="0" w:defUIPriority="99" w:defSemiHidden="0" w:defUnhideWhenUsed="0" w:defQFormat="0" w:count="376">
     <w:lsdException w:name="Normal" w:uiPriority="0" w:qFormat="1"/>
     <w:lsdException w:name="heading 1" w:uiPriority="9" w:qFormat="1"/>
-    <w:lsdException w:name="heading 2" w:semiHidden="1" w:uiPriority="9" w:unhideWhenUsed="1" w:qFormat="1"/>
-    <w:lsdException w:name="heading 3" w:semiHidden="1" w:uiPriority="9" w:unhideWhenUsed="1" w:qFormat="1"/>
-    <w:lsdException w:name="heading 4" w:semiHidden="1" w:uiPriority="9" w:unhideWhenUsed="1" w:qFormat="1"/>
-    <w:lsdException w:name="heading 5" w:semiHidden="1" w:uiPriority="9" w:unhideWhenUsed="1" w:qFormat="1"/>
-    <w:lsdException w:name="heading 6" w:semiHidden="1" w:uiPriority="9" w:unhideWhenUsed="1" w:qFormat="1"/>
-    <w:lsdException w:name="heading 7" w:semiHidden="1" w:uiPriority="9" w:unhideWhenUsed="1" w:qFormat="1"/>
-    <w:lsdException w:name="heading 8" w:semiHidden="1" w:uiPriority="9" w:unhideWhenUsed="1" w:qFormat="1"/>
-    <w:lsdException w:name="heading 9" w:semiHidden="1" w:uiPriority="9" w:unhideWhenUsed="1" w:qFormat="1"/>
+    <w:lsdException w:name="heading 2" w:uiPriority="9" w:semiHidden="1" w:unhideWhenUsed="1" w:qFormat="1"/>
+    <w:lsdException w:name="heading 3" w:uiPriority="9" w:semiHidden="1" w:unhideWhenUsed="1" w:qFormat="1"/>
+    <w:lsdException w:name="heading 4" w:uiPriority="9" w:semiHidden="1" w:unhideWhenUsed="1" w:qFormat="1"/>
+    <w:lsdException w:name="heading 5" w:uiPriority="9" w:semiHidden="1" w:unhideWhenUsed="1" w:qFormat="1"/>
+    <w:lsdException w:name="heading 6" w:uiPriority="9" w:semiHidden="1" w:unhideWhenUsed="1" w:qFormat="1"/>
+    <w:lsdException w:name="heading 7" w:uiPriority="9" w:semiHidden="1" w:unhideWhenUsed="1" w:qFormat="1"/>
+    <w:lsdException w:name="heading 8" w:uiPriority="9" w:semiHidden="1" w:unhideWhenUsed="1" w:qFormat="1"/>
+    <w:lsdException w:name="heading 9" w:uiPriority="9" w:semiHidden="1" w:unhideWhenUsed="1" w:qFormat="1"/>
     <w:lsdException w:name="index 1" w:semiHidden="1" w:unhideWhenUsed="1"/>
     <w:lsdException w:name="index 2" w:semiHidden="1" w:unhideWhenUsed="1"/>
     <w:lsdException w:name="index 3" w:semiHidden="1" w:unhideWhenUsed="1"/>
@@ -1733,22 +2154,22 @@
     <w:lsdException w:name="index 7" w:semiHidden="1" w:unhideWhenUsed="1"/>
     <w:lsdException w:name="index 8" w:semiHidden="1" w:unhideWhenUsed="1"/>
     <w:lsdException w:name="index 9" w:semiHidden="1" w:unhideWhenUsed="1"/>
-    <w:lsdException w:name="toc 1" w:semiHidden="1" w:uiPriority="39" w:unhideWhenUsed="1"/>
-    <w:lsdException w:name="toc 2" w:semiHidden="1" w:uiPriority="39" w:unhideWhenUsed="1"/>
-    <w:lsdException w:name="toc 3" w:semiHidden="1" w:uiPriority="39" w:unhideWhenUsed="1"/>
-    <w:lsdException w:name="toc 4" w:semiHidden="1" w:uiPriority="39" w:unhideWhenUsed="1"/>
-    <w:lsdException w:name="toc 5" w:semiHidden="1" w:uiPriority="39" w:unhideWhenUsed="1"/>
-    <w:lsdException w:name="toc 6" w:semiHidden="1" w:uiPriority="39" w:unhideWhenUsed="1"/>
-    <w:lsdException w:name="toc 7" w:semiHidden="1" w:uiPriority="39" w:unhideWhenUsed="1"/>
-    <w:lsdException w:name="toc 8" w:semiHidden="1" w:uiPriority="39" w:unhideWhenUsed="1"/>
-    <w:lsdException w:name="toc 9" w:semiHidden="1" w:uiPriority="39" w:unhideWhenUsed="1"/>
+    <w:lsdException w:name="toc 1" w:uiPriority="39" w:semiHidden="1" w:unhideWhenUsed="1"/>
+    <w:lsdException w:name="toc 2" w:uiPriority="39" w:semiHidden="1" w:unhideWhenUsed="1"/>
+    <w:lsdException w:name="toc 3" w:uiPriority="39" w:semiHidden="1" w:unhideWhenUsed="1"/>
+    <w:lsdException w:name="toc 4" w:uiPriority="39" w:semiHidden="1" w:unhideWhenUsed="1"/>
+    <w:lsdException w:name="toc 5" w:uiPriority="39" w:semiHidden="1" w:unhideWhenUsed="1"/>
+    <w:lsdException w:name="toc 6" w:uiPriority="39" w:semiHidden="1" w:unhideWhenUsed="1"/>
+    <w:lsdException w:name="toc 7" w:uiPriority="39" w:semiHidden="1" w:unhideWhenUsed="1"/>
+    <w:lsdException w:name="toc 8" w:uiPriority="39" w:semiHidden="1" w:unhideWhenUsed="1"/>
+    <w:lsdException w:name="toc 9" w:uiPriority="39" w:semiHidden="1" w:unhideWhenUsed="1"/>
     <w:lsdException w:name="Normal Indent" w:semiHidden="1" w:unhideWhenUsed="1"/>
     <w:lsdException w:name="footnote text" w:semiHidden="1" w:unhideWhenUsed="1"/>
     <w:lsdException w:name="annotation text" w:semiHidden="1" w:unhideWhenUsed="1"/>
     <w:lsdException w:name="header" w:semiHidden="1" w:unhideWhenUsed="1"/>
     <w:lsdException w:name="footer" w:semiHidden="1" w:unhideWhenUsed="1"/>
     <w:lsdException w:name="index heading" w:semiHidden="1" w:unhideWhenUsed="1"/>
-    <w:lsdException w:name="caption" w:semiHidden="1" w:uiPriority="35" w:unhideWhenUsed="1" w:qFormat="1"/>
+    <w:lsdException w:name="caption" w:uiPriority="35" w:semiHidden="1" w:unhideWhenUsed="1" w:qFormat="1"/>
     <w:lsdException w:name="table of figures" w:semiHidden="1" w:unhideWhenUsed="1"/>
     <w:lsdException w:name="envelope address" w:semiHidden="1" w:unhideWhenUsed="1"/>
     <w:lsdException w:name="envelope return" w:semiHidden="1" w:unhideWhenUsed="1"/>
@@ -1779,7 +2200,7 @@
     <w:lsdException w:name="Title" w:uiPriority="10" w:qFormat="1"/>
     <w:lsdException w:name="Closing" w:semiHidden="1" w:unhideWhenUsed="1"/>
     <w:lsdException w:name="Signature" w:semiHidden="1" w:unhideWhenUsed="1"/>
-    <w:lsdException w:name="Default Paragraph Font" w:semiHidden="1" w:uiPriority="1" w:unhideWhenUsed="1"/>
+    <w:lsdException w:name="Default Paragraph Font" w:uiPriority="1" w:semiHidden="1" w:unhideWhenUsed="1"/>
     <w:lsdException w:name="Body Text" w:semiHidden="1" w:unhideWhenUsed="1"/>
     <w:lsdException w:name="Body Text Indent" w:semiHidden="1" w:unhideWhenUsed="1"/>
     <w:lsdException w:name="List Continue" w:semiHidden="1" w:unhideWhenUsed="1"/>
@@ -1979,8 +2400,8 @@
     <w:lsdException w:name="Subtle Reference" w:uiPriority="31" w:qFormat="1"/>
     <w:lsdException w:name="Intense Reference" w:uiPriority="32" w:qFormat="1"/>
     <w:lsdException w:name="Book Title" w:uiPriority="33" w:qFormat="1"/>
-    <w:lsdException w:name="Bibliography" w:semiHidden="1" w:uiPriority="37" w:unhideWhenUsed="1"/>
-    <w:lsdException w:name="TOC Heading" w:semiHidden="1" w:uiPriority="39" w:unhideWhenUsed="1" w:qFormat="1"/>
+    <w:lsdException w:name="Bibliography" w:uiPriority="37" w:semiHidden="1" w:unhideWhenUsed="1"/>
+    <w:lsdException w:name="TOC Heading" w:uiPriority="39" w:semiHidden="1" w:unhideWhenUsed="1" w:qFormat="1"/>
     <w:lsdException w:name="Plain Table 1" w:uiPriority="41"/>
     <w:lsdException w:name="Plain Table 2" w:uiPriority="42"/>
     <w:lsdException w:name="Plain Table 3" w:uiPriority="43"/>
@@ -2091,43 +2512,49 @@
     <w:lsdException w:name="Unresolved Mention" w:semiHidden="1" w:unhideWhenUsed="1"/>
     <w:lsdException w:name="Smart Link" w:semiHidden="1" w:unhideWhenUsed="1"/>
   </w:latentStyles>
-  <w:style w:type="paragraph" w:default="1" w:styleId="Normal">
+  <w:style w:type="paragraph" w:styleId="Normal" w:default="1">
     <w:name w:val="Normal"/>
     <w:qFormat/>
-    <w:rsid w:val="00A03FAC"/>
+    <w:rsid w:val="00a03fac"/>
     <w:pPr>
-      <w:spacing w:line="259" w:lineRule="auto"/>
+      <w:widowControl/>
+      <w:bidi w:val="0"/>
+      <w:spacing w:lineRule="auto" w:line="259" w:before="0" w:after="160"/>
+      <w:jc w:val="left"/>
     </w:pPr>
     <w:rPr>
+      <w:rFonts w:ascii="Aptos" w:hAnsi="Aptos" w:eastAsia="Aptos" w:cs="" w:asciiTheme="minorHAnsi" w:cstheme="minorBidi" w:eastAsiaTheme="minorHAnsi" w:hAnsiTheme="minorHAnsi"/>
+      <w:color w:val="auto"/>
       <w:kern w:val="0"/>
       <w:sz w:val="22"/>
       <w:szCs w:val="22"/>
-      <w:lang w:val="en-GB"/>
+      <w:lang w:val="en-GB" w:eastAsia="en-US" w:bidi="ar-SA"/>
+      <w14:ligatures w14:val="standardContextual"/>
     </w:rPr>
   </w:style>
   <w:style w:type="paragraph" w:styleId="Heading1">
-    <w:name w:val="heading 1"/>
+    <w:name w:val="Heading 1"/>
     <w:basedOn w:val="Normal"/>
     <w:next w:val="Normal"/>
     <w:link w:val="Heading1Char"/>
     <w:uiPriority w:val="9"/>
     <w:qFormat/>
-    <w:rsid w:val="00A03FAC"/>
+    <w:rsid w:val="00a03fac"/>
     <w:pPr>
-      <w:keepNext/>
+      <w:keepNext w:val="true"/>
       <w:keepLines/>
       <w:spacing w:before="360" w:after="80"/>
       <w:outlineLvl w:val="0"/>
     </w:pPr>
     <w:rPr>
-      <w:rFonts w:asciiTheme="majorHAnsi" w:eastAsiaTheme="majorEastAsia" w:hAnsiTheme="majorHAnsi" w:cstheme="majorBidi"/>
-      <w:color w:val="0F4761" w:themeColor="accent1" w:themeShade="BF"/>
+      <w:rFonts w:ascii="Aptos Display" w:hAnsi="Aptos Display" w:eastAsia="" w:cs="" w:asciiTheme="majorHAnsi" w:cstheme="majorBidi" w:eastAsiaTheme="majorEastAsia" w:hAnsiTheme="majorHAnsi"/>
+      <w:color w:val="0F4761" w:themeColor="accent1" w:themeShade="bf"/>
       <w:sz w:val="40"/>
       <w:szCs w:val="40"/>
     </w:rPr>
   </w:style>
   <w:style w:type="paragraph" w:styleId="Heading2">
-    <w:name w:val="heading 2"/>
+    <w:name w:val="Heading 2"/>
     <w:basedOn w:val="Normal"/>
     <w:next w:val="Normal"/>
     <w:link w:val="Heading2Char"/>
@@ -2135,22 +2562,22 @@
     <w:semiHidden/>
     <w:unhideWhenUsed/>
     <w:qFormat/>
-    <w:rsid w:val="00A03FAC"/>
+    <w:rsid w:val="00a03fac"/>
     <w:pPr>
-      <w:keepNext/>
+      <w:keepNext w:val="true"/>
       <w:keepLines/>
       <w:spacing w:before="160" w:after="80"/>
       <w:outlineLvl w:val="1"/>
     </w:pPr>
     <w:rPr>
-      <w:rFonts w:asciiTheme="majorHAnsi" w:eastAsiaTheme="majorEastAsia" w:hAnsiTheme="majorHAnsi" w:cstheme="majorBidi"/>
-      <w:color w:val="0F4761" w:themeColor="accent1" w:themeShade="BF"/>
+      <w:rFonts w:ascii="Aptos Display" w:hAnsi="Aptos Display" w:eastAsia="" w:cs="" w:asciiTheme="majorHAnsi" w:cstheme="majorBidi" w:eastAsiaTheme="majorEastAsia" w:hAnsiTheme="majorHAnsi"/>
+      <w:color w:val="0F4761" w:themeColor="accent1" w:themeShade="bf"/>
       <w:sz w:val="32"/>
       <w:szCs w:val="32"/>
     </w:rPr>
   </w:style>
   <w:style w:type="paragraph" w:styleId="Heading3">
-    <w:name w:val="heading 3"/>
+    <w:name w:val="Heading 3"/>
     <w:basedOn w:val="Normal"/>
     <w:next w:val="Normal"/>
     <w:link w:val="Heading3Char"/>
@@ -2158,22 +2585,22 @@
     <w:semiHidden/>
     <w:unhideWhenUsed/>
     <w:qFormat/>
-    <w:rsid w:val="00A03FAC"/>
+    <w:rsid w:val="00a03fac"/>
     <w:pPr>
-      <w:keepNext/>
+      <w:keepNext w:val="true"/>
       <w:keepLines/>
       <w:spacing w:before="160" w:after="80"/>
       <w:outlineLvl w:val="2"/>
     </w:pPr>
     <w:rPr>
-      <w:rFonts w:eastAsiaTheme="majorEastAsia" w:cstheme="majorBidi"/>
-      <w:color w:val="0F4761" w:themeColor="accent1" w:themeShade="BF"/>
+      <w:rFonts w:eastAsia="" w:cs="" w:cstheme="majorBidi" w:eastAsiaTheme="majorEastAsia"/>
+      <w:color w:val="0F4761" w:themeColor="accent1" w:themeShade="bf"/>
       <w:sz w:val="28"/>
       <w:szCs w:val="28"/>
     </w:rPr>
   </w:style>
   <w:style w:type="paragraph" w:styleId="Heading4">
-    <w:name w:val="heading 4"/>
+    <w:name w:val="Heading 4"/>
     <w:basedOn w:val="Normal"/>
     <w:next w:val="Normal"/>
     <w:link w:val="Heading4Char"/>
@@ -2181,22 +2608,22 @@
     <w:semiHidden/>
     <w:unhideWhenUsed/>
     <w:qFormat/>
-    <w:rsid w:val="00A03FAC"/>
+    <w:rsid w:val="00a03fac"/>
     <w:pPr>
-      <w:keepNext/>
+      <w:keepNext w:val="true"/>
       <w:keepLines/>
       <w:spacing w:before="80" w:after="40"/>
       <w:outlineLvl w:val="3"/>
     </w:pPr>
     <w:rPr>
-      <w:rFonts w:eastAsiaTheme="majorEastAsia" w:cstheme="majorBidi"/>
+      <w:rFonts w:eastAsia="" w:cs="" w:cstheme="majorBidi" w:eastAsiaTheme="majorEastAsia"/>
       <w:i/>
       <w:iCs/>
-      <w:color w:val="0F4761" w:themeColor="accent1" w:themeShade="BF"/>
+      <w:color w:val="0F4761" w:themeColor="accent1" w:themeShade="bf"/>
     </w:rPr>
   </w:style>
   <w:style w:type="paragraph" w:styleId="Heading5">
-    <w:name w:val="heading 5"/>
+    <w:name w:val="Heading 5"/>
     <w:basedOn w:val="Normal"/>
     <w:next w:val="Normal"/>
     <w:link w:val="Heading5Char"/>
@@ -2204,20 +2631,20 @@
     <w:semiHidden/>
     <w:unhideWhenUsed/>
     <w:qFormat/>
-    <w:rsid w:val="00A03FAC"/>
+    <w:rsid w:val="00a03fac"/>
     <w:pPr>
-      <w:keepNext/>
+      <w:keepNext w:val="true"/>
       <w:keepLines/>
       <w:spacing w:before="80" w:after="40"/>
       <w:outlineLvl w:val="4"/>
     </w:pPr>
     <w:rPr>
-      <w:rFonts w:eastAsiaTheme="majorEastAsia" w:cstheme="majorBidi"/>
-      <w:color w:val="0F4761" w:themeColor="accent1" w:themeShade="BF"/>
+      <w:rFonts w:eastAsia="" w:cs="" w:cstheme="majorBidi" w:eastAsiaTheme="majorEastAsia"/>
+      <w:color w:val="0F4761" w:themeColor="accent1" w:themeShade="bf"/>
     </w:rPr>
   </w:style>
   <w:style w:type="paragraph" w:styleId="Heading6">
-    <w:name w:val="heading 6"/>
+    <w:name w:val="Heading 6"/>
     <w:basedOn w:val="Normal"/>
     <w:next w:val="Normal"/>
     <w:link w:val="Heading6Char"/>
@@ -2225,22 +2652,22 @@
     <w:semiHidden/>
     <w:unhideWhenUsed/>
     <w:qFormat/>
-    <w:rsid w:val="00A03FAC"/>
+    <w:rsid w:val="00a03fac"/>
     <w:pPr>
-      <w:keepNext/>
+      <w:keepNext w:val="true"/>
       <w:keepLines/>
       <w:spacing w:before="40" w:after="0"/>
       <w:outlineLvl w:val="5"/>
     </w:pPr>
     <w:rPr>
-      <w:rFonts w:eastAsiaTheme="majorEastAsia" w:cstheme="majorBidi"/>
+      <w:rFonts w:eastAsia="" w:cs="" w:cstheme="majorBidi" w:eastAsiaTheme="majorEastAsia"/>
       <w:i/>
       <w:iCs/>
-      <w:color w:val="595959" w:themeColor="text1" w:themeTint="A6"/>
+      <w:color w:val="595959" w:themeColor="text1" w:themeTint="a6"/>
     </w:rPr>
   </w:style>
   <w:style w:type="paragraph" w:styleId="Heading7">
-    <w:name w:val="heading 7"/>
+    <w:name w:val="Heading 7"/>
     <w:basedOn w:val="Normal"/>
     <w:next w:val="Normal"/>
     <w:link w:val="Heading7Char"/>
@@ -2248,20 +2675,20 @@
     <w:semiHidden/>
     <w:unhideWhenUsed/>
     <w:qFormat/>
-    <w:rsid w:val="00A03FAC"/>
+    <w:rsid w:val="00a03fac"/>
     <w:pPr>
-      <w:keepNext/>
+      <w:keepNext w:val="true"/>
       <w:keepLines/>
       <w:spacing w:before="40" w:after="0"/>
       <w:outlineLvl w:val="6"/>
     </w:pPr>
     <w:rPr>
-      <w:rFonts w:eastAsiaTheme="majorEastAsia" w:cstheme="majorBidi"/>
-      <w:color w:val="595959" w:themeColor="text1" w:themeTint="A6"/>
+      <w:rFonts w:eastAsia="" w:cs="" w:cstheme="majorBidi" w:eastAsiaTheme="majorEastAsia"/>
+      <w:color w:val="595959" w:themeColor="text1" w:themeTint="a6"/>
     </w:rPr>
   </w:style>
   <w:style w:type="paragraph" w:styleId="Heading8">
-    <w:name w:val="heading 8"/>
+    <w:name w:val="Heading 8"/>
     <w:basedOn w:val="Normal"/>
     <w:next w:val="Normal"/>
     <w:link w:val="Heading8Char"/>
@@ -2269,22 +2696,22 @@
     <w:semiHidden/>
     <w:unhideWhenUsed/>
     <w:qFormat/>
-    <w:rsid w:val="00A03FAC"/>
+    <w:rsid w:val="00a03fac"/>
     <w:pPr>
-      <w:keepNext/>
+      <w:keepNext w:val="true"/>
       <w:keepLines/>
-      <w:spacing w:after="0"/>
+      <w:spacing w:before="0" w:after="0"/>
       <w:outlineLvl w:val="7"/>
     </w:pPr>
     <w:rPr>
-      <w:rFonts w:eastAsiaTheme="majorEastAsia" w:cstheme="majorBidi"/>
+      <w:rFonts w:eastAsia="" w:cs="" w:cstheme="majorBidi" w:eastAsiaTheme="majorEastAsia"/>
       <w:i/>
       <w:iCs/>
-      <w:color w:val="272727" w:themeColor="text1" w:themeTint="D8"/>
+      <w:color w:val="272727" w:themeColor="text1" w:themeTint="d8"/>
     </w:rPr>
   </w:style>
   <w:style w:type="paragraph" w:styleId="Heading9">
-    <w:name w:val="heading 9"/>
+    <w:name w:val="Heading 9"/>
     <w:basedOn w:val="Normal"/>
     <w:next w:val="Normal"/>
     <w:link w:val="Heading9Char"/>
@@ -2292,23 +2719,436 @@
     <w:semiHidden/>
     <w:unhideWhenUsed/>
     <w:qFormat/>
-    <w:rsid w:val="00A03FAC"/>
+    <w:rsid w:val="00a03fac"/>
     <w:pPr>
-      <w:keepNext/>
+      <w:keepNext w:val="true"/>
       <w:keepLines/>
-      <w:spacing w:after="0"/>
+      <w:spacing w:before="0" w:after="0"/>
       <w:outlineLvl w:val="8"/>
     </w:pPr>
     <w:rPr>
-      <w:rFonts w:eastAsiaTheme="majorEastAsia" w:cstheme="majorBidi"/>
-      <w:color w:val="272727" w:themeColor="text1" w:themeTint="D8"/>
-    </w:rPr>
-  </w:style>
-  <w:style w:type="character" w:default="1" w:styleId="DefaultParagraphFont">
+      <w:rFonts w:eastAsia="" w:cs="" w:cstheme="majorBidi" w:eastAsiaTheme="majorEastAsia"/>
+      <w:color w:val="272727" w:themeColor="text1" w:themeTint="d8"/>
+    </w:rPr>
+  </w:style>
+  <w:style w:type="character" w:styleId="DefaultParagraphFont" w:default="1">
     <w:name w:val="Default Paragraph Font"/>
     <w:uiPriority w:val="1"/>
     <w:semiHidden/>
     <w:unhideWhenUsed/>
+    <w:qFormat/>
+    <w:rPr/>
+  </w:style>
+  <w:style w:type="character" w:styleId="Heading1Char" w:customStyle="1">
+    <w:name w:val="Heading 1 Char"/>
+    <w:basedOn w:val="DefaultParagraphFont"/>
+    <w:link w:val="Heading1"/>
+    <w:uiPriority w:val="9"/>
+    <w:qFormat/>
+    <w:rsid w:val="00a03fac"/>
+    <w:rPr>
+      <w:rFonts w:ascii="Aptos Display" w:hAnsi="Aptos Display" w:eastAsia="" w:cs="" w:asciiTheme="majorHAnsi" w:cstheme="majorBidi" w:eastAsiaTheme="majorEastAsia" w:hAnsiTheme="majorHAnsi"/>
+      <w:color w:val="0F4761" w:themeColor="accent1" w:themeShade="bf"/>
+      <w:sz w:val="40"/>
+      <w:szCs w:val="40"/>
+    </w:rPr>
+  </w:style>
+  <w:style w:type="character" w:styleId="Heading2Char" w:customStyle="1">
+    <w:name w:val="Heading 2 Char"/>
+    <w:basedOn w:val="DefaultParagraphFont"/>
+    <w:link w:val="Heading2"/>
+    <w:uiPriority w:val="9"/>
+    <w:semiHidden/>
+    <w:qFormat/>
+    <w:rsid w:val="00a03fac"/>
+    <w:rPr>
+      <w:rFonts w:ascii="Aptos Display" w:hAnsi="Aptos Display" w:eastAsia="" w:cs="" w:asciiTheme="majorHAnsi" w:cstheme="majorBidi" w:eastAsiaTheme="majorEastAsia" w:hAnsiTheme="majorHAnsi"/>
+      <w:color w:val="0F4761" w:themeColor="accent1" w:themeShade="bf"/>
+      <w:sz w:val="32"/>
+      <w:szCs w:val="32"/>
+    </w:rPr>
+  </w:style>
+  <w:style w:type="character" w:styleId="Heading3Char" w:customStyle="1">
+    <w:name w:val="Heading 3 Char"/>
+    <w:basedOn w:val="DefaultParagraphFont"/>
+    <w:link w:val="Heading3"/>
+    <w:uiPriority w:val="9"/>
+    <w:semiHidden/>
+    <w:qFormat/>
+    <w:rsid w:val="00a03fac"/>
+    <w:rPr>
+      <w:rFonts w:eastAsia="" w:cs="" w:cstheme="majorBidi" w:eastAsiaTheme="majorEastAsia"/>
+      <w:color w:val="0F4761" w:themeColor="accent1" w:themeShade="bf"/>
+      <w:sz w:val="28"/>
+      <w:szCs w:val="28"/>
+    </w:rPr>
+  </w:style>
+  <w:style w:type="character" w:styleId="Heading4Char" w:customStyle="1">
+    <w:name w:val="Heading 4 Char"/>
+    <w:basedOn w:val="DefaultParagraphFont"/>
+    <w:link w:val="Heading4"/>
+    <w:uiPriority w:val="9"/>
+    <w:semiHidden/>
+    <w:qFormat/>
+    <w:rsid w:val="00a03fac"/>
+    <w:rPr>
+      <w:rFonts w:eastAsia="" w:cs="" w:cstheme="majorBidi" w:eastAsiaTheme="majorEastAsia"/>
+      <w:i/>
+      <w:iCs/>
+      <w:color w:val="0F4761" w:themeColor="accent1" w:themeShade="bf"/>
+    </w:rPr>
+  </w:style>
+  <w:style w:type="character" w:styleId="Heading5Char" w:customStyle="1">
+    <w:name w:val="Heading 5 Char"/>
+    <w:basedOn w:val="DefaultParagraphFont"/>
+    <w:link w:val="Heading5"/>
+    <w:uiPriority w:val="9"/>
+    <w:semiHidden/>
+    <w:qFormat/>
+    <w:rsid w:val="00a03fac"/>
+    <w:rPr>
+      <w:rFonts w:eastAsia="" w:cs="" w:cstheme="majorBidi" w:eastAsiaTheme="majorEastAsia"/>
+      <w:color w:val="0F4761" w:themeColor="accent1" w:themeShade="bf"/>
+    </w:rPr>
+  </w:style>
+  <w:style w:type="character" w:styleId="Heading6Char" w:customStyle="1">
+    <w:name w:val="Heading 6 Char"/>
+    <w:basedOn w:val="DefaultParagraphFont"/>
+    <w:link w:val="Heading6"/>
+    <w:uiPriority w:val="9"/>
+    <w:semiHidden/>
+    <w:qFormat/>
+    <w:rsid w:val="00a03fac"/>
+    <w:rPr>
+      <w:rFonts w:eastAsia="" w:cs="" w:cstheme="majorBidi" w:eastAsiaTheme="majorEastAsia"/>
+      <w:i/>
+      <w:iCs/>
+      <w:color w:val="595959" w:themeColor="text1" w:themeTint="a6"/>
+    </w:rPr>
+  </w:style>
+  <w:style w:type="character" w:styleId="Heading7Char" w:customStyle="1">
+    <w:name w:val="Heading 7 Char"/>
+    <w:basedOn w:val="DefaultParagraphFont"/>
+    <w:link w:val="Heading7"/>
+    <w:uiPriority w:val="9"/>
+    <w:semiHidden/>
+    <w:qFormat/>
+    <w:rsid w:val="00a03fac"/>
+    <w:rPr>
+      <w:rFonts w:eastAsia="" w:cs="" w:cstheme="majorBidi" w:eastAsiaTheme="majorEastAsia"/>
+      <w:color w:val="595959" w:themeColor="text1" w:themeTint="a6"/>
+    </w:rPr>
+  </w:style>
+  <w:style w:type="character" w:styleId="Heading8Char" w:customStyle="1">
+    <w:name w:val="Heading 8 Char"/>
+    <w:basedOn w:val="DefaultParagraphFont"/>
+    <w:link w:val="Heading8"/>
+    <w:uiPriority w:val="9"/>
+    <w:semiHidden/>
+    <w:qFormat/>
+    <w:rsid w:val="00a03fac"/>
+    <w:rPr>
+      <w:rFonts w:eastAsia="" w:cs="" w:cstheme="majorBidi" w:eastAsiaTheme="majorEastAsia"/>
+      <w:i/>
+      <w:iCs/>
+      <w:color w:val="272727" w:themeColor="text1" w:themeTint="d8"/>
+    </w:rPr>
+  </w:style>
+  <w:style w:type="character" w:styleId="Heading9Char" w:customStyle="1">
+    <w:name w:val="Heading 9 Char"/>
+    <w:basedOn w:val="DefaultParagraphFont"/>
+    <w:link w:val="Heading9"/>
+    <w:uiPriority w:val="9"/>
+    <w:semiHidden/>
+    <w:qFormat/>
+    <w:rsid w:val="00a03fac"/>
+    <w:rPr>
+      <w:rFonts w:eastAsia="" w:cs="" w:cstheme="majorBidi" w:eastAsiaTheme="majorEastAsia"/>
+      <w:color w:val="272727" w:themeColor="text1" w:themeTint="d8"/>
+    </w:rPr>
+  </w:style>
+  <w:style w:type="character" w:styleId="TitleChar" w:customStyle="1">
+    <w:name w:val="Title Char"/>
+    <w:basedOn w:val="DefaultParagraphFont"/>
+    <w:link w:val="Title"/>
+    <w:uiPriority w:val="10"/>
+    <w:qFormat/>
+    <w:rsid w:val="00a03fac"/>
+    <w:rPr>
+      <w:rFonts w:ascii="Aptos Display" w:hAnsi="Aptos Display" w:eastAsia="" w:cs="" w:asciiTheme="majorHAnsi" w:cstheme="majorBidi" w:eastAsiaTheme="majorEastAsia" w:hAnsiTheme="majorHAnsi"/>
+      <w:spacing w:val="-10"/>
+      <w:kern w:val="2"/>
+      <w:sz w:val="56"/>
+      <w:szCs w:val="56"/>
+    </w:rPr>
+  </w:style>
+  <w:style w:type="character" w:styleId="SubtitleChar" w:customStyle="1">
+    <w:name w:val="Subtitle Char"/>
+    <w:basedOn w:val="DefaultParagraphFont"/>
+    <w:link w:val="Subtitle"/>
+    <w:uiPriority w:val="11"/>
+    <w:qFormat/>
+    <w:rsid w:val="00a03fac"/>
+    <w:rPr>
+      <w:rFonts w:eastAsia="" w:cs="" w:cstheme="majorBidi" w:eastAsiaTheme="majorEastAsia"/>
+      <w:color w:val="595959" w:themeColor="text1" w:themeTint="a6"/>
+      <w:spacing w:val="15"/>
+      <w:sz w:val="28"/>
+      <w:szCs w:val="28"/>
+    </w:rPr>
+  </w:style>
+  <w:style w:type="character" w:styleId="QuoteChar" w:customStyle="1">
+    <w:name w:val="Quote Char"/>
+    <w:basedOn w:val="DefaultParagraphFont"/>
+    <w:link w:val="Quote"/>
+    <w:uiPriority w:val="29"/>
+    <w:qFormat/>
+    <w:rsid w:val="00a03fac"/>
+    <w:rPr>
+      <w:i/>
+      <w:iCs/>
+      <w:color w:val="404040" w:themeColor="text1" w:themeTint="bf"/>
+    </w:rPr>
+  </w:style>
+  <w:style w:type="character" w:styleId="IntenseEmphasis">
+    <w:name w:val="Intense Emphasis"/>
+    <w:basedOn w:val="DefaultParagraphFont"/>
+    <w:uiPriority w:val="21"/>
+    <w:qFormat/>
+    <w:rsid w:val="00a03fac"/>
+    <w:rPr>
+      <w:i/>
+      <w:iCs/>
+      <w:color w:val="0F4761" w:themeColor="accent1" w:themeShade="bf"/>
+    </w:rPr>
+  </w:style>
+  <w:style w:type="character" w:styleId="IntenseQuoteChar" w:customStyle="1">
+    <w:name w:val="Intense Quote Char"/>
+    <w:basedOn w:val="DefaultParagraphFont"/>
+    <w:link w:val="IntenseQuote"/>
+    <w:uiPriority w:val="30"/>
+    <w:qFormat/>
+    <w:rsid w:val="00a03fac"/>
+    <w:rPr>
+      <w:i/>
+      <w:iCs/>
+      <w:color w:val="0F4761" w:themeColor="accent1" w:themeShade="bf"/>
+    </w:rPr>
+  </w:style>
+  <w:style w:type="character" w:styleId="IntenseReference">
+    <w:name w:val="Intense Reference"/>
+    <w:basedOn w:val="DefaultParagraphFont"/>
+    <w:uiPriority w:val="32"/>
+    <w:qFormat/>
+    <w:rsid w:val="00a03fac"/>
+    <w:rPr>
+      <w:b/>
+      <w:bCs/>
+      <w:smallCaps/>
+      <w:color w:val="0F4761" w:themeColor="accent1" w:themeShade="bf"/>
+      <w:spacing w:val="5"/>
+    </w:rPr>
+  </w:style>
+  <w:style w:type="character" w:styleId="FooterChar" w:customStyle="1">
+    <w:name w:val="Footer Char"/>
+    <w:basedOn w:val="DefaultParagraphFont"/>
+    <w:link w:val="Footer"/>
+    <w:uiPriority w:val="99"/>
+    <w:qFormat/>
+    <w:rsid w:val="00a03fac"/>
+    <w:rPr>
+      <w:kern w:val="0"/>
+      <w:sz w:val="22"/>
+      <w:szCs w:val="22"/>
+      <w:lang w:val="en-GB"/>
+    </w:rPr>
+  </w:style>
+  <w:style w:type="character" w:styleId="SourceText">
+    <w:name w:val="Source Text"/>
+    <w:qFormat/>
+    <w:rPr>
+      <w:rFonts w:ascii="Liberation Mono" w:hAnsi="Liberation Mono" w:eastAsia="Liberation Mono" w:cs="Liberation Mono"/>
+    </w:rPr>
+  </w:style>
+  <w:style w:type="paragraph" w:styleId="Heading">
+    <w:name w:val="Heading"/>
+    <w:basedOn w:val="Normal"/>
+    <w:next w:val="TextBody"/>
+    <w:qFormat/>
+    <w:pPr>
+      <w:keepNext w:val="true"/>
+      <w:spacing w:before="240" w:after="120"/>
+    </w:pPr>
+    <w:rPr>
+      <w:rFonts w:ascii="Liberation Sans" w:hAnsi="Liberation Sans" w:eastAsia="Noto Sans CJK SC" w:cs="Lohit Devanagari"/>
+      <w:sz w:val="28"/>
+      <w:szCs w:val="28"/>
+    </w:rPr>
+  </w:style>
+  <w:style w:type="paragraph" w:styleId="TextBody">
+    <w:name w:val="Body Text"/>
+    <w:basedOn w:val="Normal"/>
+    <w:pPr>
+      <w:spacing w:lineRule="auto" w:line="276" w:before="0" w:after="140"/>
+    </w:pPr>
+    <w:rPr/>
+  </w:style>
+  <w:style w:type="paragraph" w:styleId="List">
+    <w:name w:val="List"/>
+    <w:basedOn w:val="TextBody"/>
+    <w:pPr/>
+    <w:rPr>
+      <w:rFonts w:cs="Lohit Devanagari"/>
+    </w:rPr>
+  </w:style>
+  <w:style w:type="paragraph" w:styleId="Caption">
+    <w:name w:val="Caption"/>
+    <w:basedOn w:val="Normal"/>
+    <w:qFormat/>
+    <w:pPr>
+      <w:suppressLineNumbers/>
+      <w:spacing w:before="120" w:after="120"/>
+    </w:pPr>
+    <w:rPr>
+      <w:rFonts w:cs="Lohit Devanagari"/>
+      <w:i/>
+      <w:iCs/>
+      <w:sz w:val="24"/>
+      <w:szCs w:val="24"/>
+    </w:rPr>
+  </w:style>
+  <w:style w:type="paragraph" w:styleId="Index">
+    <w:name w:val="Index"/>
+    <w:basedOn w:val="Normal"/>
+    <w:qFormat/>
+    <w:pPr>
+      <w:suppressLineNumbers/>
+    </w:pPr>
+    <w:rPr>
+      <w:rFonts w:cs="Lohit Devanagari"/>
+    </w:rPr>
+  </w:style>
+  <w:style w:type="paragraph" w:styleId="Title">
+    <w:name w:val="Title"/>
+    <w:basedOn w:val="Normal"/>
+    <w:next w:val="Normal"/>
+    <w:link w:val="TitleChar"/>
+    <w:uiPriority w:val="10"/>
+    <w:qFormat/>
+    <w:rsid w:val="00a03fac"/>
+    <w:pPr>
+      <w:spacing w:lineRule="auto" w:line="240" w:before="0" w:after="80"/>
+      <w:contextualSpacing/>
+    </w:pPr>
+    <w:rPr>
+      <w:rFonts w:ascii="Aptos Display" w:hAnsi="Aptos Display" w:eastAsia="" w:cs="" w:asciiTheme="majorHAnsi" w:cstheme="majorBidi" w:eastAsiaTheme="majorEastAsia" w:hAnsiTheme="majorHAnsi"/>
+      <w:spacing w:val="-10"/>
+      <w:kern w:val="2"/>
+      <w:sz w:val="56"/>
+      <w:szCs w:val="56"/>
+    </w:rPr>
+  </w:style>
+  <w:style w:type="paragraph" w:styleId="Subtitle">
+    <w:name w:val="Subtitle"/>
+    <w:basedOn w:val="Normal"/>
+    <w:next w:val="Normal"/>
+    <w:link w:val="SubtitleChar"/>
+    <w:uiPriority w:val="11"/>
+    <w:qFormat/>
+    <w:rsid w:val="00a03fac"/>
+    <w:pPr/>
+    <w:rPr>
+      <w:rFonts w:eastAsia="" w:cs="" w:cstheme="majorBidi" w:eastAsiaTheme="majorEastAsia"/>
+      <w:color w:val="595959" w:themeColor="text1" w:themeTint="a6"/>
+      <w:spacing w:val="15"/>
+      <w:sz w:val="28"/>
+      <w:szCs w:val="28"/>
+    </w:rPr>
+  </w:style>
+  <w:style w:type="paragraph" w:styleId="Quote">
+    <w:name w:val="Quote"/>
+    <w:basedOn w:val="Normal"/>
+    <w:next w:val="Normal"/>
+    <w:link w:val="QuoteChar"/>
+    <w:uiPriority w:val="29"/>
+    <w:qFormat/>
+    <w:rsid w:val="00a03fac"/>
+    <w:pPr>
+      <w:spacing w:before="160" w:after="160"/>
+      <w:jc w:val="center"/>
+    </w:pPr>
+    <w:rPr>
+      <w:i/>
+      <w:iCs/>
+      <w:color w:val="404040" w:themeColor="text1" w:themeTint="bf"/>
+    </w:rPr>
+  </w:style>
+  <w:style w:type="paragraph" w:styleId="ListParagraph">
+    <w:name w:val="List Paragraph"/>
+    <w:basedOn w:val="Normal"/>
+    <w:uiPriority w:val="34"/>
+    <w:qFormat/>
+    <w:rsid w:val="00a03fac"/>
+    <w:pPr>
+      <w:spacing w:before="0" w:after="160"/>
+      <w:ind w:left="720" w:hanging="0"/>
+      <w:contextualSpacing/>
+    </w:pPr>
+    <w:rPr/>
+  </w:style>
+  <w:style w:type="paragraph" w:styleId="IntenseQuote">
+    <w:name w:val="Intense Quote"/>
+    <w:basedOn w:val="Normal"/>
+    <w:next w:val="Normal"/>
+    <w:link w:val="IntenseQuoteChar"/>
+    <w:uiPriority w:val="30"/>
+    <w:qFormat/>
+    <w:rsid w:val="00a03fac"/>
+    <w:pPr>
+      <w:pBdr>
+        <w:top w:val="single" w:sz="4" w:space="10" w:color="0F4761"/>
+        <w:bottom w:val="single" w:sz="4" w:space="10" w:color="0F4761"/>
+      </w:pBdr>
+      <w:spacing w:before="360" w:after="360"/>
+      <w:ind w:left="864" w:right="864" w:hanging="0"/>
+      <w:jc w:val="center"/>
+    </w:pPr>
+    <w:rPr>
+      <w:i/>
+      <w:iCs/>
+      <w:color w:val="0F4761" w:themeColor="accent1" w:themeShade="bf"/>
+    </w:rPr>
+  </w:style>
+  <w:style w:type="paragraph" w:styleId="HeaderandFooter">
+    <w:name w:val="Header and Footer"/>
+    <w:basedOn w:val="Normal"/>
+    <w:qFormat/>
+    <w:pPr/>
+    <w:rPr/>
+  </w:style>
+  <w:style w:type="paragraph" w:styleId="Footer">
+    <w:name w:val="Footer"/>
+    <w:basedOn w:val="Normal"/>
+    <w:link w:val="FooterChar"/>
+    <w:uiPriority w:val="99"/>
+    <w:unhideWhenUsed/>
+    <w:rsid w:val="00a03fac"/>
+    <w:pPr>
+      <w:tabs>
+        <w:tab w:val="clear" w:pos="720"/>
+        <w:tab w:val="center" w:pos="4513" w:leader="none"/>
+        <w:tab w:val="right" w:pos="9026" w:leader="none"/>
+      </w:tabs>
+      <w:spacing w:lineRule="auto" w:line="240" w:before="0" w:after="0"/>
+    </w:pPr>
+    <w:rPr/>
+  </w:style>
+  <w:style w:type="numbering" w:styleId="NoList" w:default="1">
+    <w:name w:val="No List"/>
+    <w:uiPriority w:val="99"/>
+    <w:semiHidden/>
+    <w:unhideWhenUsed/>
+    <w:qFormat/>
   </w:style>
   <w:style w:type="table" w:default="1" w:styleId="TableNormal">
     <w:name w:val="Normal Table"/>
@@ -2316,7 +3156,6 @@
     <w:semiHidden/>
     <w:unhideWhenUsed/>
     <w:tblPr>
-      <w:tblInd w:w="0" w:type="dxa"/>
       <w:tblCellMar>
         <w:top w:w="0" w:type="dxa"/>
         <w:left w:w="108" w:type="dxa"/>
@@ -2325,354 +3164,29 @@
       </w:tblCellMar>
     </w:tblPr>
   </w:style>
-  <w:style w:type="numbering" w:default="1" w:styleId="NoList">
-    <w:name w:val="No List"/>
-    <w:uiPriority w:val="99"/>
-    <w:semiHidden/>
-    <w:unhideWhenUsed/>
-  </w:style>
-  <w:style w:type="character" w:customStyle="1" w:styleId="Heading1Char">
-    <w:name w:val="Heading 1 Char"/>
-    <w:basedOn w:val="DefaultParagraphFont"/>
-    <w:link w:val="Heading1"/>
-    <w:uiPriority w:val="9"/>
-    <w:rsid w:val="00A03FAC"/>
-    <w:rPr>
-      <w:rFonts w:asciiTheme="majorHAnsi" w:eastAsiaTheme="majorEastAsia" w:hAnsiTheme="majorHAnsi" w:cstheme="majorBidi"/>
-      <w:color w:val="0F4761" w:themeColor="accent1" w:themeShade="BF"/>
-      <w:sz w:val="40"/>
-      <w:szCs w:val="40"/>
-    </w:rPr>
-  </w:style>
-  <w:style w:type="character" w:customStyle="1" w:styleId="Heading2Char">
-    <w:name w:val="Heading 2 Char"/>
-    <w:basedOn w:val="DefaultParagraphFont"/>
-    <w:link w:val="Heading2"/>
-    <w:uiPriority w:val="9"/>
-    <w:semiHidden/>
-    <w:rsid w:val="00A03FAC"/>
-    <w:rPr>
-      <w:rFonts w:asciiTheme="majorHAnsi" w:eastAsiaTheme="majorEastAsia" w:hAnsiTheme="majorHAnsi" w:cstheme="majorBidi"/>
-      <w:color w:val="0F4761" w:themeColor="accent1" w:themeShade="BF"/>
-      <w:sz w:val="32"/>
-      <w:szCs w:val="32"/>
-    </w:rPr>
-  </w:style>
-  <w:style w:type="character" w:customStyle="1" w:styleId="Heading3Char">
-    <w:name w:val="Heading 3 Char"/>
-    <w:basedOn w:val="DefaultParagraphFont"/>
-    <w:link w:val="Heading3"/>
-    <w:uiPriority w:val="9"/>
-    <w:semiHidden/>
-    <w:rsid w:val="00A03FAC"/>
-    <w:rPr>
-      <w:rFonts w:eastAsiaTheme="majorEastAsia" w:cstheme="majorBidi"/>
-      <w:color w:val="0F4761" w:themeColor="accent1" w:themeShade="BF"/>
-      <w:sz w:val="28"/>
-      <w:szCs w:val="28"/>
-    </w:rPr>
-  </w:style>
-  <w:style w:type="character" w:customStyle="1" w:styleId="Heading4Char">
-    <w:name w:val="Heading 4 Char"/>
-    <w:basedOn w:val="DefaultParagraphFont"/>
-    <w:link w:val="Heading4"/>
-    <w:uiPriority w:val="9"/>
-    <w:semiHidden/>
-    <w:rsid w:val="00A03FAC"/>
-    <w:rPr>
-      <w:rFonts w:eastAsiaTheme="majorEastAsia" w:cstheme="majorBidi"/>
-      <w:i/>
-      <w:iCs/>
-      <w:color w:val="0F4761" w:themeColor="accent1" w:themeShade="BF"/>
-    </w:rPr>
-  </w:style>
-  <w:style w:type="character" w:customStyle="1" w:styleId="Heading5Char">
-    <w:name w:val="Heading 5 Char"/>
-    <w:basedOn w:val="DefaultParagraphFont"/>
-    <w:link w:val="Heading5"/>
-    <w:uiPriority w:val="9"/>
-    <w:semiHidden/>
-    <w:rsid w:val="00A03FAC"/>
-    <w:rPr>
-      <w:rFonts w:eastAsiaTheme="majorEastAsia" w:cstheme="majorBidi"/>
-      <w:color w:val="0F4761" w:themeColor="accent1" w:themeShade="BF"/>
-    </w:rPr>
-  </w:style>
-  <w:style w:type="character" w:customStyle="1" w:styleId="Heading6Char">
-    <w:name w:val="Heading 6 Char"/>
-    <w:basedOn w:val="DefaultParagraphFont"/>
-    <w:link w:val="Heading6"/>
-    <w:uiPriority w:val="9"/>
-    <w:semiHidden/>
-    <w:rsid w:val="00A03FAC"/>
-    <w:rPr>
-      <w:rFonts w:eastAsiaTheme="majorEastAsia" w:cstheme="majorBidi"/>
-      <w:i/>
-      <w:iCs/>
-      <w:color w:val="595959" w:themeColor="text1" w:themeTint="A6"/>
-    </w:rPr>
-  </w:style>
-  <w:style w:type="character" w:customStyle="1" w:styleId="Heading7Char">
-    <w:name w:val="Heading 7 Char"/>
-    <w:basedOn w:val="DefaultParagraphFont"/>
-    <w:link w:val="Heading7"/>
-    <w:uiPriority w:val="9"/>
-    <w:semiHidden/>
-    <w:rsid w:val="00A03FAC"/>
-    <w:rPr>
-      <w:rFonts w:eastAsiaTheme="majorEastAsia" w:cstheme="majorBidi"/>
-      <w:color w:val="595959" w:themeColor="text1" w:themeTint="A6"/>
-    </w:rPr>
-  </w:style>
-  <w:style w:type="character" w:customStyle="1" w:styleId="Heading8Char">
-    <w:name w:val="Heading 8 Char"/>
-    <w:basedOn w:val="DefaultParagraphFont"/>
-    <w:link w:val="Heading8"/>
-    <w:uiPriority w:val="9"/>
-    <w:semiHidden/>
-    <w:rsid w:val="00A03FAC"/>
-    <w:rPr>
-      <w:rFonts w:eastAsiaTheme="majorEastAsia" w:cstheme="majorBidi"/>
-      <w:i/>
-      <w:iCs/>
-      <w:color w:val="272727" w:themeColor="text1" w:themeTint="D8"/>
-    </w:rPr>
-  </w:style>
-  <w:style w:type="character" w:customStyle="1" w:styleId="Heading9Char">
-    <w:name w:val="Heading 9 Char"/>
-    <w:basedOn w:val="DefaultParagraphFont"/>
-    <w:link w:val="Heading9"/>
-    <w:uiPriority w:val="9"/>
-    <w:semiHidden/>
-    <w:rsid w:val="00A03FAC"/>
-    <w:rPr>
-      <w:rFonts w:eastAsiaTheme="majorEastAsia" w:cstheme="majorBidi"/>
-      <w:color w:val="272727" w:themeColor="text1" w:themeTint="D8"/>
-    </w:rPr>
-  </w:style>
-  <w:style w:type="paragraph" w:styleId="Title">
-    <w:name w:val="Title"/>
-    <w:basedOn w:val="Normal"/>
-    <w:next w:val="Normal"/>
-    <w:link w:val="TitleChar"/>
-    <w:uiPriority w:val="10"/>
-    <w:qFormat/>
-    <w:rsid w:val="00A03FAC"/>
-    <w:pPr>
-      <w:spacing w:after="80" w:line="240" w:lineRule="auto"/>
-      <w:contextualSpacing/>
-    </w:pPr>
-    <w:rPr>
-      <w:rFonts w:asciiTheme="majorHAnsi" w:eastAsiaTheme="majorEastAsia" w:hAnsiTheme="majorHAnsi" w:cstheme="majorBidi"/>
-      <w:spacing w:val="-10"/>
-      <w:kern w:val="28"/>
-      <w:sz w:val="56"/>
-      <w:szCs w:val="56"/>
-    </w:rPr>
-  </w:style>
-  <w:style w:type="character" w:customStyle="1" w:styleId="TitleChar">
-    <w:name w:val="Title Char"/>
-    <w:basedOn w:val="DefaultParagraphFont"/>
-    <w:link w:val="Title"/>
-    <w:uiPriority w:val="10"/>
-    <w:rsid w:val="00A03FAC"/>
-    <w:rPr>
-      <w:rFonts w:asciiTheme="majorHAnsi" w:eastAsiaTheme="majorEastAsia" w:hAnsiTheme="majorHAnsi" w:cstheme="majorBidi"/>
-      <w:spacing w:val="-10"/>
-      <w:kern w:val="28"/>
-      <w:sz w:val="56"/>
-      <w:szCs w:val="56"/>
-    </w:rPr>
-  </w:style>
-  <w:style w:type="paragraph" w:styleId="Subtitle">
-    <w:name w:val="Subtitle"/>
-    <w:basedOn w:val="Normal"/>
-    <w:next w:val="Normal"/>
-    <w:link w:val="SubtitleChar"/>
-    <w:uiPriority w:val="11"/>
-    <w:qFormat/>
-    <w:rsid w:val="00A03FAC"/>
-    <w:pPr>
-      <w:numPr>
-        <w:ilvl w:val="1"/>
-      </w:numPr>
-    </w:pPr>
-    <w:rPr>
-      <w:rFonts w:eastAsiaTheme="majorEastAsia" w:cstheme="majorBidi"/>
-      <w:color w:val="595959" w:themeColor="text1" w:themeTint="A6"/>
-      <w:spacing w:val="15"/>
-      <w:sz w:val="28"/>
-      <w:szCs w:val="28"/>
-    </w:rPr>
-  </w:style>
-  <w:style w:type="character" w:customStyle="1" w:styleId="SubtitleChar">
-    <w:name w:val="Subtitle Char"/>
-    <w:basedOn w:val="DefaultParagraphFont"/>
-    <w:link w:val="Subtitle"/>
-    <w:uiPriority w:val="11"/>
-    <w:rsid w:val="00A03FAC"/>
-    <w:rPr>
-      <w:rFonts w:eastAsiaTheme="majorEastAsia" w:cstheme="majorBidi"/>
-      <w:color w:val="595959" w:themeColor="text1" w:themeTint="A6"/>
-      <w:spacing w:val="15"/>
-      <w:sz w:val="28"/>
-      <w:szCs w:val="28"/>
-    </w:rPr>
-  </w:style>
-  <w:style w:type="paragraph" w:styleId="Quote">
-    <w:name w:val="Quote"/>
-    <w:basedOn w:val="Normal"/>
-    <w:next w:val="Normal"/>
-    <w:link w:val="QuoteChar"/>
-    <w:uiPriority w:val="29"/>
-    <w:qFormat/>
-    <w:rsid w:val="00A03FAC"/>
-    <w:pPr>
-      <w:spacing w:before="160"/>
-      <w:jc w:val="center"/>
-    </w:pPr>
-    <w:rPr>
-      <w:i/>
-      <w:iCs/>
-      <w:color w:val="404040" w:themeColor="text1" w:themeTint="BF"/>
-    </w:rPr>
-  </w:style>
-  <w:style w:type="character" w:customStyle="1" w:styleId="QuoteChar">
-    <w:name w:val="Quote Char"/>
-    <w:basedOn w:val="DefaultParagraphFont"/>
-    <w:link w:val="Quote"/>
-    <w:uiPriority w:val="29"/>
-    <w:rsid w:val="00A03FAC"/>
-    <w:rPr>
-      <w:i/>
-      <w:iCs/>
-      <w:color w:val="404040" w:themeColor="text1" w:themeTint="BF"/>
-    </w:rPr>
-  </w:style>
-  <w:style w:type="paragraph" w:styleId="ListParagraph">
-    <w:name w:val="List Paragraph"/>
-    <w:basedOn w:val="Normal"/>
-    <w:uiPriority w:val="34"/>
-    <w:qFormat/>
-    <w:rsid w:val="00A03FAC"/>
-    <w:pPr>
-      <w:ind w:left="720"/>
-      <w:contextualSpacing/>
-    </w:pPr>
-  </w:style>
-  <w:style w:type="character" w:styleId="IntenseEmphasis">
-    <w:name w:val="Intense Emphasis"/>
-    <w:basedOn w:val="DefaultParagraphFont"/>
-    <w:uiPriority w:val="21"/>
-    <w:qFormat/>
-    <w:rsid w:val="00A03FAC"/>
-    <w:rPr>
-      <w:i/>
-      <w:iCs/>
-      <w:color w:val="0F4761" w:themeColor="accent1" w:themeShade="BF"/>
-    </w:rPr>
-  </w:style>
-  <w:style w:type="paragraph" w:styleId="IntenseQuote">
-    <w:name w:val="Intense Quote"/>
-    <w:basedOn w:val="Normal"/>
-    <w:next w:val="Normal"/>
-    <w:link w:val="IntenseQuoteChar"/>
-    <w:uiPriority w:val="30"/>
-    <w:qFormat/>
-    <w:rsid w:val="00A03FAC"/>
-    <w:pPr>
-      <w:pBdr>
-        <w:top w:val="single" w:sz="4" w:space="10" w:color="0F4761" w:themeColor="accent1" w:themeShade="BF"/>
-        <w:bottom w:val="single" w:sz="4" w:space="10" w:color="0F4761" w:themeColor="accent1" w:themeShade="BF"/>
-      </w:pBdr>
-      <w:spacing w:before="360" w:after="360"/>
-      <w:ind w:left="864" w:right="864"/>
-      <w:jc w:val="center"/>
-    </w:pPr>
-    <w:rPr>
-      <w:i/>
-      <w:iCs/>
-      <w:color w:val="0F4761" w:themeColor="accent1" w:themeShade="BF"/>
-    </w:rPr>
-  </w:style>
-  <w:style w:type="character" w:customStyle="1" w:styleId="IntenseQuoteChar">
-    <w:name w:val="Intense Quote Char"/>
-    <w:basedOn w:val="DefaultParagraphFont"/>
-    <w:link w:val="IntenseQuote"/>
-    <w:uiPriority w:val="30"/>
-    <w:rsid w:val="00A03FAC"/>
-    <w:rPr>
-      <w:i/>
-      <w:iCs/>
-      <w:color w:val="0F4761" w:themeColor="accent1" w:themeShade="BF"/>
-    </w:rPr>
-  </w:style>
-  <w:style w:type="character" w:styleId="IntenseReference">
-    <w:name w:val="Intense Reference"/>
-    <w:basedOn w:val="DefaultParagraphFont"/>
-    <w:uiPriority w:val="32"/>
-    <w:qFormat/>
-    <w:rsid w:val="00A03FAC"/>
-    <w:rPr>
-      <w:b/>
-      <w:bCs/>
-      <w:smallCaps/>
-      <w:color w:val="0F4761" w:themeColor="accent1" w:themeShade="BF"/>
-      <w:spacing w:val="5"/>
-    </w:rPr>
-  </w:style>
   <w:style w:type="table" w:styleId="TableGrid">
     <w:name w:val="Table Grid"/>
     <w:basedOn w:val="TableNormal"/>
     <w:uiPriority w:val="39"/>
-    <w:rsid w:val="00A03FAC"/>
+    <w:rsid w:val="00a03fac"/>
     <w:pPr>
       <w:spacing w:after="0" w:line="240" w:lineRule="auto"/>
     </w:pPr>
     <w:rPr>
-      <w:kern w:val="0"/>
+      <w:lang w:val="en-GB"/>
       <w:sz w:val="22"/>
       <w:szCs w:val="22"/>
-      <w:lang w:val="en-GB"/>
     </w:rPr>
     <w:tblPr>
       <w:tblBorders>
-        <w:top w:val="single" w:sz="4" w:space="0" w:color="auto"/>
-        <w:left w:val="single" w:sz="4" w:space="0" w:color="auto"/>
-        <w:bottom w:val="single" w:sz="4" w:space="0" w:color="auto"/>
-        <w:right w:val="single" w:sz="4" w:space="0" w:color="auto"/>
-        <w:insideH w:val="single" w:sz="4" w:space="0" w:color="auto"/>
-        <w:insideV w:val="single" w:sz="4" w:space="0" w:color="auto"/>
+        <w:top w:val="single" w:color="auto" w:sz="4" w:space="0"/>
+        <w:left w:val="single" w:color="auto" w:sz="4" w:space="0"/>
+        <w:bottom w:val="single" w:color="auto" w:sz="4" w:space="0"/>
+        <w:right w:val="single" w:color="auto" w:sz="4" w:space="0"/>
+        <w:insideH w:val="single" w:color="auto" w:sz="4" w:space="0"/>
+        <w:insideV w:val="single" w:color="auto" w:sz="4" w:space="0"/>
       </w:tblBorders>
     </w:tblPr>
-  </w:style>
-  <w:style w:type="paragraph" w:styleId="Footer">
-    <w:name w:val="footer"/>
-    <w:basedOn w:val="Normal"/>
-    <w:link w:val="FooterChar"/>
-    <w:uiPriority w:val="99"/>
-    <w:unhideWhenUsed/>
-    <w:rsid w:val="00A03FAC"/>
-    <w:pPr>
-      <w:tabs>
-        <w:tab w:val="center" w:pos="4513"/>
-        <w:tab w:val="right" w:pos="9026"/>
-      </w:tabs>
-      <w:spacing w:after="0" w:line="240" w:lineRule="auto"/>
-    </w:pPr>
-  </w:style>
-  <w:style w:type="character" w:customStyle="1" w:styleId="FooterChar">
-    <w:name w:val="Footer Char"/>
-    <w:basedOn w:val="DefaultParagraphFont"/>
-    <w:link w:val="Footer"/>
-    <w:uiPriority w:val="99"/>
-    <w:rsid w:val="00A03FAC"/>
-    <w:rPr>
-      <w:kern w:val="0"/>
-      <w:sz w:val="22"/>
-      <w:szCs w:val="22"/>
-      <w:lang w:val="en-GB"/>
-    </w:rPr>
   </w:style>
 </w:styles>
 </file>

</xml_diff>